<commit_message>
Napaka pri report-u, ko dodam repeater na polja mi nič ne izpiše, Dodal še action na rental list
</commit_message>
<xml_diff>
--- a/Bicycle-Rental-Report.docx
+++ b/Bicycle-Rental-Report.docx
@@ -129,320 +129,538 @@
         <w:jc w:val="center"/>
       </w:pPr>
     </w:p>
-    <w:tbl>
-      <w:tblPr>
-        <w:tblStyle w:val="Tabelamrea"/>
-        <w:tblW w:w="9658" w:type="dxa"/>
-        <w:tblLayout w:type="fixed"/>
-        <w:tblLook w:val="04A0" w:firstRow="1" w:lastRow="0" w:firstColumn="1" w:lastColumn="0" w:noHBand="0" w:noVBand="1"/>
-      </w:tblPr>
-      <w:tblGrid>
-        <w:gridCol w:w="988"/>
-        <w:gridCol w:w="1701"/>
-        <w:gridCol w:w="2126"/>
-        <w:gridCol w:w="1559"/>
-        <w:gridCol w:w="1701"/>
-        <w:gridCol w:w="709"/>
-        <w:gridCol w:w="874"/>
-      </w:tblGrid>
-      <w:tr>
+    <w:sdt>
+      <w:sdtPr>
+        <w:id w:val="-520394645"/>
+        <w15:dataBinding w:prefixMappings="xmlns:ns0='urn:microsoft-dynamics-nav/reports/Bicycle_Rental_Report/50400/' " w:xpath="/ns0:NavWordReportXmlPart[1]/ns0:Customer" w:storeItemID="{773EEAEE-57CF-46CA-BEB5-CD936B803A2D}"/>
+        <w15:repeatingSection/>
+        <w:alias w:val="#Nav: /Customer"/>
+        <w:tag w:val="#Nav: Bicycle_Rental_Report/50400"/>
+      </w:sdtPr>
+      <w:sdtContent>
         <w:sdt>
           <w:sdtPr>
-            <w:alias w:val="#Nav: /Labels/No_Caption"/>
-            <w:tag w:val="#Nav: Bicycle_Rental_Report/50400"/>
-            <w:id w:val="-750117088"/>
+            <w:id w:val="-1932352544"/>
             <w:placeholder>
-              <w:docPart w:val="DefaultPlaceholder_-1854013440"/>
+              <w:docPart w:val="DefaultPlaceholder_-1854013435"/>
             </w:placeholder>
-            <w:dataBinding w:prefixMappings="xmlns:ns0='urn:microsoft-dynamics-nav/reports/Bicycle_Rental_Report/50400/' " w:xpath="/ns0:NavWordReportXmlPart[1]/ns0:Labels[1]/ns0:No_Caption[1]" w:storeItemID="{773EEAEE-57CF-46CA-BEB5-CD936B803A2D}"/>
-            <w:text/>
+            <w15:repeatingSectionItem/>
           </w:sdtPr>
           <w:sdtContent>
-            <w:tc>
-              <w:tcPr>
-                <w:tcW w:w="988" w:type="dxa"/>
-              </w:tcPr>
-              <w:p>
-                <w:pPr>
-                  <w:jc w:val="center"/>
-                </w:pPr>
-                <w:proofErr w:type="spellStart"/>
-                <w:r>
-                  <w:t>No_Caption</w:t>
-                </w:r>
-                <w:proofErr w:type="spellEnd"/>
-              </w:p>
-            </w:tc>
-          </w:sdtContent>
-        </w:sdt>
-        <w:sdt>
-          <w:sdtPr>
-            <w:alias w:val="#Nav: /Labels/Rental_DateCaption"/>
-            <w:tag w:val="#Nav: Bicycle_Rental_Report/50400"/>
-            <w:id w:val="-397058469"/>
-            <w:placeholder>
-              <w:docPart w:val="DefaultPlaceholder_-1854013440"/>
-            </w:placeholder>
-            <w:dataBinding w:prefixMappings="xmlns:ns0='urn:microsoft-dynamics-nav/reports/Bicycle_Rental_Report/50400/' " w:xpath="/ns0:NavWordReportXmlPart[1]/ns0:Labels[1]/ns0:Rental_DateCaption[1]" w:storeItemID="{773EEAEE-57CF-46CA-BEB5-CD936B803A2D}"/>
-            <w:text/>
-          </w:sdtPr>
-          <w:sdtContent>
-            <w:tc>
-              <w:tcPr>
-                <w:tcW w:w="1701" w:type="dxa"/>
-              </w:tcPr>
-              <w:p>
-                <w:pPr>
-                  <w:jc w:val="center"/>
-                </w:pPr>
-                <w:proofErr w:type="spellStart"/>
-                <w:r>
-                  <w:t>Rental_DateCaption</w:t>
-                </w:r>
-                <w:proofErr w:type="spellEnd"/>
-              </w:p>
-            </w:tc>
-          </w:sdtContent>
-        </w:sdt>
-        <w:sdt>
-          <w:sdtPr>
-            <w:alias w:val="#Nav: /Labels/Bicycle_No_Caption"/>
-            <w:tag w:val="#Nav: Bicycle_Rental_Report/50400"/>
-            <w:id w:val="867953051"/>
-            <w:placeholder>
-              <w:docPart w:val="DefaultPlaceholder_-1854013440"/>
-            </w:placeholder>
-            <w:dataBinding w:prefixMappings="xmlns:ns0='urn:microsoft-dynamics-nav/reports/Bicycle_Rental_Report/50400/' " w:xpath="/ns0:NavWordReportXmlPart[1]/ns0:Labels[1]/ns0:Bicycle_No_Caption[1]" w:storeItemID="{773EEAEE-57CF-46CA-BEB5-CD936B803A2D}"/>
-            <w:text/>
-          </w:sdtPr>
-          <w:sdtContent>
-            <w:tc>
-              <w:tcPr>
-                <w:tcW w:w="2126" w:type="dxa"/>
-              </w:tcPr>
-              <w:p>
-                <w:pPr>
-                  <w:jc w:val="center"/>
-                </w:pPr>
-                <w:proofErr w:type="spellStart"/>
-                <w:r>
-                  <w:t>Bicycle_No_Caption</w:t>
-                </w:r>
-                <w:proofErr w:type="spellEnd"/>
-              </w:p>
-            </w:tc>
-          </w:sdtContent>
-        </w:sdt>
-        <w:sdt>
-          <w:sdtPr>
-            <w:alias w:val="#Nav: /Labels/DescriptionCaption"/>
-            <w:tag w:val="#Nav: Bicycle_Rental_Report/50400"/>
-            <w:id w:val="280924568"/>
-            <w:placeholder>
-              <w:docPart w:val="DefaultPlaceholder_-1854013440"/>
-            </w:placeholder>
-            <w:dataBinding w:prefixMappings="xmlns:ns0='urn:microsoft-dynamics-nav/reports/Bicycle_Rental_Report/50400/' " w:xpath="/ns0:NavWordReportXmlPart[1]/ns0:Labels[1]/ns0:DescriptionCaption[1]" w:storeItemID="{773EEAEE-57CF-46CA-BEB5-CD936B803A2D}"/>
-            <w:text/>
-          </w:sdtPr>
-          <w:sdtContent>
-            <w:tc>
-              <w:tcPr>
-                <w:tcW w:w="1559" w:type="dxa"/>
-              </w:tcPr>
-              <w:p>
-                <w:pPr>
-                  <w:jc w:val="center"/>
-                </w:pPr>
-                <w:proofErr w:type="spellStart"/>
-                <w:r>
-                  <w:t>DescriptionCaption</w:t>
-                </w:r>
-                <w:proofErr w:type="spellEnd"/>
-              </w:p>
-            </w:tc>
-          </w:sdtContent>
-        </w:sdt>
-        <w:sdt>
-          <w:sdtPr>
-            <w:alias w:val="#Nav: /Labels/Rental_DaysCaption"/>
-            <w:tag w:val="#Nav: Bicycle_Rental_Report/50400"/>
-            <w:id w:val="884998558"/>
-            <w:placeholder>
-              <w:docPart w:val="DefaultPlaceholder_-1854013440"/>
-            </w:placeholder>
-            <w:dataBinding w:prefixMappings="xmlns:ns0='urn:microsoft-dynamics-nav/reports/Bicycle_Rental_Report/50400/' " w:xpath="/ns0:NavWordReportXmlPart[1]/ns0:Labels[1]/ns0:Rental_DaysCaption[1]" w:storeItemID="{773EEAEE-57CF-46CA-BEB5-CD936B803A2D}"/>
-            <w:text/>
-          </w:sdtPr>
-          <w:sdtContent>
-            <w:tc>
-              <w:tcPr>
-                <w:tcW w:w="1701" w:type="dxa"/>
-              </w:tcPr>
-              <w:p>
-                <w:pPr>
-                  <w:jc w:val="center"/>
-                </w:pPr>
-                <w:proofErr w:type="spellStart"/>
-                <w:r>
-                  <w:t>Rental_DaysCaption</w:t>
-                </w:r>
-                <w:proofErr w:type="spellEnd"/>
-              </w:p>
-            </w:tc>
-          </w:sdtContent>
-        </w:sdt>
-        <w:sdt>
-          <w:sdtPr>
-            <w:alias w:val="#Nav: /Labels/Daily_RateCaption"/>
-            <w:tag w:val="#Nav: Bicycle_Rental_Report/50400"/>
-            <w:id w:val="-360129310"/>
-            <w:placeholder>
-              <w:docPart w:val="DefaultPlaceholder_-1854013440"/>
-            </w:placeholder>
-            <w:dataBinding w:prefixMappings="xmlns:ns0='urn:microsoft-dynamics-nav/reports/Bicycle_Rental_Report/50400/' " w:xpath="/ns0:NavWordReportXmlPart[1]/ns0:Labels[1]/ns0:Daily_RateCaption[1]" w:storeItemID="{773EEAEE-57CF-46CA-BEB5-CD936B803A2D}"/>
-            <w:text/>
-          </w:sdtPr>
-          <w:sdtContent>
-            <w:tc>
-              <w:tcPr>
-                <w:tcW w:w="709" w:type="dxa"/>
-              </w:tcPr>
-              <w:p>
-                <w:pPr>
-                  <w:jc w:val="center"/>
-                </w:pPr>
-                <w:proofErr w:type="spellStart"/>
-                <w:r>
-                  <w:t>Daily_RateCaption</w:t>
-                </w:r>
-                <w:proofErr w:type="spellEnd"/>
-              </w:p>
-            </w:tc>
-          </w:sdtContent>
-        </w:sdt>
-        <w:sdt>
-          <w:sdtPr>
-            <w:alias w:val="#Nav: /Labels/Line_AmountCaption"/>
-            <w:tag w:val="#Nav: Bicycle_Rental_Report/50400"/>
-            <w:id w:val="-642809030"/>
-            <w:placeholder>
-              <w:docPart w:val="DefaultPlaceholder_-1854013440"/>
-            </w:placeholder>
-            <w:dataBinding w:prefixMappings="xmlns:ns0='urn:microsoft-dynamics-nav/reports/Bicycle_Rental_Report/50400/' " w:xpath="/ns0:NavWordReportXmlPart[1]/ns0:Labels[1]/ns0:Line_AmountCaption[1]" w:storeItemID="{773EEAEE-57CF-46CA-BEB5-CD936B803A2D}"/>
-            <w:text/>
-          </w:sdtPr>
-          <w:sdtContent>
-            <w:tc>
-              <w:tcPr>
-                <w:tcW w:w="874" w:type="dxa"/>
-              </w:tcPr>
-              <w:p>
-                <w:pPr>
-                  <w:jc w:val="center"/>
-                </w:pPr>
-                <w:proofErr w:type="spellStart"/>
-                <w:r>
-                  <w:t>Line_AmountCaption</w:t>
-                </w:r>
-                <w:proofErr w:type="spellEnd"/>
-              </w:p>
-            </w:tc>
-          </w:sdtContent>
-        </w:sdt>
-      </w:tr>
-      <w:sdt>
-        <w:sdtPr>
-          <w:id w:val="1375428484"/>
-          <w15:dataBinding w:prefixMappings="xmlns:ns0='urn:microsoft-dynamics-nav/reports/Bicycle_Rental_Report/50400/' " w:xpath="/ns0:NavWordReportXmlPart[1]/ns0:Customer[1]/ns0:Rental_Header[1]/ns0:Rental_Line" w:storeItemID="{773EEAEE-57CF-46CA-BEB5-CD936B803A2D}"/>
-          <w15:repeatingSection/>
-        </w:sdtPr>
-        <w:sdtContent>
-          <w:sdt>
-            <w:sdtPr>
-              <w:id w:val="-687596154"/>
-              <w:placeholder>
-                <w:docPart w:val="DefaultPlaceholder_-1854013435"/>
-              </w:placeholder>
-              <w15:repeatingSectionItem/>
-            </w:sdtPr>
-            <w:sdtContent>
+            <w:tbl>
+              <w:tblPr>
+                <w:tblStyle w:val="Tabelamrea"/>
+                <w:tblW w:w="9658" w:type="dxa"/>
+                <w:tblLayout w:type="fixed"/>
+                <w:tblLook w:val="04A0" w:firstRow="1" w:lastRow="0" w:firstColumn="1" w:lastColumn="0" w:noHBand="0" w:noVBand="1"/>
+              </w:tblPr>
+              <w:tblGrid>
+                <w:gridCol w:w="988"/>
+                <w:gridCol w:w="1701"/>
+                <w:gridCol w:w="2126"/>
+                <w:gridCol w:w="1559"/>
+                <w:gridCol w:w="1701"/>
+                <w:gridCol w:w="709"/>
+                <w:gridCol w:w="874"/>
+              </w:tblGrid>
               <w:tr>
                 <w:tc>
                   <w:tcPr>
-                    <w:tcW w:w="988" w:type="dxa"/>
+                    <w:tcW w:w="9658" w:type="dxa"/>
+                    <w:gridSpan w:val="7"/>
                   </w:tcPr>
                   <w:p>
-                    <w:pPr>
-                      <w:jc w:val="center"/>
-                    </w:pPr>
-                  </w:p>
-                </w:tc>
-                <w:tc>
-                  <w:tcPr>
-                    <w:tcW w:w="1701" w:type="dxa"/>
-                  </w:tcPr>
-                  <w:p>
-                    <w:pPr>
-                      <w:jc w:val="center"/>
-                    </w:pPr>
-                  </w:p>
-                </w:tc>
-                <w:tc>
-                  <w:tcPr>
-                    <w:tcW w:w="2126" w:type="dxa"/>
-                  </w:tcPr>
-                  <w:p>
-                    <w:pPr>
-                      <w:jc w:val="center"/>
-                    </w:pPr>
-                  </w:p>
-                </w:tc>
-                <w:tc>
-                  <w:tcPr>
-                    <w:tcW w:w="1559" w:type="dxa"/>
-                  </w:tcPr>
-                  <w:p>
-                    <w:pPr>
-                      <w:jc w:val="center"/>
-                    </w:pPr>
-                  </w:p>
-                </w:tc>
-                <w:tc>
-                  <w:tcPr>
-                    <w:tcW w:w="1701" w:type="dxa"/>
-                  </w:tcPr>
-                  <w:p>
-                    <w:pPr>
-                      <w:jc w:val="center"/>
-                    </w:pPr>
-                  </w:p>
-                </w:tc>
-                <w:tc>
-                  <w:tcPr>
-                    <w:tcW w:w="709" w:type="dxa"/>
-                  </w:tcPr>
-                  <w:p>
-                    <w:pPr>
-                      <w:jc w:val="center"/>
-                    </w:pPr>
-                  </w:p>
-                </w:tc>
-                <w:tc>
-                  <w:tcPr>
-                    <w:tcW w:w="874" w:type="dxa"/>
-                  </w:tcPr>
-                  <w:p>
-                    <w:pPr>
-                      <w:jc w:val="center"/>
-                    </w:pPr>
+                    <w:proofErr w:type="spellStart"/>
+                    <w:r>
+                      <w:t>Customer</w:t>
+                    </w:r>
+                    <w:proofErr w:type="spellEnd"/>
+                    <w:r>
+                      <w:t xml:space="preserve">: </w:t>
+                    </w:r>
+                    <w:sdt>
+                      <w:sdtPr>
+                        <w:alias w:val="#Nav: /Customer/CustomerName"/>
+                        <w:tag w:val="#Nav: Bicycle_Rental_Report/50400"/>
+                        <w:id w:val="764578476"/>
+                        <w:placeholder>
+                          <w:docPart w:val="DefaultPlaceholder_-1854013440"/>
+                        </w:placeholder>
+                        <w:dataBinding w:prefixMappings="xmlns:ns0='urn:microsoft-dynamics-nav/reports/Bicycle_Rental_Report/50400/' " w:xpath="/ns0:NavWordReportXmlPart[1]/ns0:Customer[1]/ns0:CustomerName[1]" w:storeItemID="{773EEAEE-57CF-46CA-BEB5-CD936B803A2D}"/>
+                        <w:text/>
+                      </w:sdtPr>
+                      <w:sdtContent>
+                        <w:proofErr w:type="spellStart"/>
+                        <w:r>
+                          <w:t>CustomerName</w:t>
+                        </w:r>
+                      </w:sdtContent>
+                    </w:sdt>
+                    <w:r>
+                      <w:t>,</w:t>
+                    </w:r>
+                    <w:sdt>
+                      <w:sdtPr>
+                        <w:alias w:val="#Nav: /Customer/CustomerNo_"/>
+                        <w:tag w:val="#Nav: Bicycle_Rental_Report/50400"/>
+                        <w:id w:val="-1062249058"/>
+                        <w:placeholder>
+                          <w:docPart w:val="DefaultPlaceholder_-1854013440"/>
+                        </w:placeholder>
+                        <w:dataBinding w:prefixMappings="xmlns:ns0='urn:microsoft-dynamics-nav/reports/Bicycle_Rental_Report/50400/' " w:xpath="/ns0:NavWordReportXmlPart[1]/ns0:Customer[1]/ns0:CustomerNo_[1]" w:storeItemID="{773EEAEE-57CF-46CA-BEB5-CD936B803A2D}"/>
+                        <w:text/>
+                      </w:sdtPr>
+                      <w:sdtContent>
+                        <w:r>
+                          <w:t>CustomerNo</w:t>
+                        </w:r>
+                        <w:proofErr w:type="spellEnd"/>
+                        <w:r>
+                          <w:t>_</w:t>
+                        </w:r>
+                      </w:sdtContent>
+                    </w:sdt>
                   </w:p>
                 </w:tc>
               </w:tr>
-            </w:sdtContent>
-          </w:sdt>
-        </w:sdtContent>
-      </w:sdt>
-    </w:tbl>
+              <w:tr>
+                <w:sdt>
+                  <w:sdtPr>
+                    <w:alias w:val="#Nav: /Labels/No_Caption"/>
+                    <w:tag w:val="#Nav: Bicycle_Rental_Report/50400"/>
+                    <w:id w:val="-750117088"/>
+                    <w:placeholder>
+                      <w:docPart w:val="DefaultPlaceholder_-1854013440"/>
+                    </w:placeholder>
+                    <w:dataBinding w:prefixMappings="xmlns:ns0='urn:microsoft-dynamics-nav/reports/Bicycle_Rental_Report/50400/' " w:xpath="/ns0:NavWordReportXmlPart[1]/ns0:Labels[1]/ns0:No_Caption[1]" w:storeItemID="{773EEAEE-57CF-46CA-BEB5-CD936B803A2D}"/>
+                    <w:text/>
+                  </w:sdtPr>
+                  <w:sdtContent>
+                    <w:tc>
+                      <w:tcPr>
+                        <w:tcW w:w="988" w:type="dxa"/>
+                      </w:tcPr>
+                      <w:p>
+                        <w:pPr>
+                          <w:jc w:val="center"/>
+                        </w:pPr>
+                        <w:proofErr w:type="spellStart"/>
+                        <w:r>
+                          <w:t>No_Caption</w:t>
+                        </w:r>
+                        <w:proofErr w:type="spellEnd"/>
+                      </w:p>
+                    </w:tc>
+                  </w:sdtContent>
+                </w:sdt>
+                <w:sdt>
+                  <w:sdtPr>
+                    <w:alias w:val="#Nav: /Labels/Rental_DateCaption"/>
+                    <w:tag w:val="#Nav: Bicycle_Rental_Report/50400"/>
+                    <w:id w:val="-397058469"/>
+                    <w:placeholder>
+                      <w:docPart w:val="DefaultPlaceholder_-1854013440"/>
+                    </w:placeholder>
+                    <w:dataBinding w:prefixMappings="xmlns:ns0='urn:microsoft-dynamics-nav/reports/Bicycle_Rental_Report/50400/' " w:xpath="/ns0:NavWordReportXmlPart[1]/ns0:Labels[1]/ns0:Rental_DateCaption[1]" w:storeItemID="{773EEAEE-57CF-46CA-BEB5-CD936B803A2D}"/>
+                    <w:text/>
+                  </w:sdtPr>
+                  <w:sdtContent>
+                    <w:tc>
+                      <w:tcPr>
+                        <w:tcW w:w="1701" w:type="dxa"/>
+                      </w:tcPr>
+                      <w:p>
+                        <w:pPr>
+                          <w:jc w:val="center"/>
+                        </w:pPr>
+                        <w:proofErr w:type="spellStart"/>
+                        <w:r>
+                          <w:t>Rental_DateCaption</w:t>
+                        </w:r>
+                        <w:proofErr w:type="spellEnd"/>
+                      </w:p>
+                    </w:tc>
+                  </w:sdtContent>
+                </w:sdt>
+                <w:sdt>
+                  <w:sdtPr>
+                    <w:alias w:val="#Nav: /Labels/Bicycle_No_Caption"/>
+                    <w:tag w:val="#Nav: Bicycle_Rental_Report/50400"/>
+                    <w:id w:val="867953051"/>
+                    <w:placeholder>
+                      <w:docPart w:val="DefaultPlaceholder_-1854013440"/>
+                    </w:placeholder>
+                    <w:dataBinding w:prefixMappings="xmlns:ns0='urn:microsoft-dynamics-nav/reports/Bicycle_Rental_Report/50400/' " w:xpath="/ns0:NavWordReportXmlPart[1]/ns0:Labels[1]/ns0:Bicycle_No_Caption[1]" w:storeItemID="{773EEAEE-57CF-46CA-BEB5-CD936B803A2D}"/>
+                    <w:text/>
+                  </w:sdtPr>
+                  <w:sdtContent>
+                    <w:tc>
+                      <w:tcPr>
+                        <w:tcW w:w="2126" w:type="dxa"/>
+                      </w:tcPr>
+                      <w:p>
+                        <w:pPr>
+                          <w:jc w:val="center"/>
+                        </w:pPr>
+                        <w:proofErr w:type="spellStart"/>
+                        <w:r>
+                          <w:t>Bicycle_No_Caption</w:t>
+                        </w:r>
+                        <w:proofErr w:type="spellEnd"/>
+                      </w:p>
+                    </w:tc>
+                  </w:sdtContent>
+                </w:sdt>
+                <w:sdt>
+                  <w:sdtPr>
+                    <w:alias w:val="#Nav: /Labels/DescriptionCaption"/>
+                    <w:tag w:val="#Nav: Bicycle_Rental_Report/50400"/>
+                    <w:id w:val="280924568"/>
+                    <w:placeholder>
+                      <w:docPart w:val="DefaultPlaceholder_-1854013440"/>
+                    </w:placeholder>
+                    <w:dataBinding w:prefixMappings="xmlns:ns0='urn:microsoft-dynamics-nav/reports/Bicycle_Rental_Report/50400/' " w:xpath="/ns0:NavWordReportXmlPart[1]/ns0:Labels[1]/ns0:DescriptionCaption[1]" w:storeItemID="{773EEAEE-57CF-46CA-BEB5-CD936B803A2D}"/>
+                    <w:text/>
+                  </w:sdtPr>
+                  <w:sdtContent>
+                    <w:tc>
+                      <w:tcPr>
+                        <w:tcW w:w="1559" w:type="dxa"/>
+                      </w:tcPr>
+                      <w:p>
+                        <w:pPr>
+                          <w:jc w:val="center"/>
+                        </w:pPr>
+                        <w:proofErr w:type="spellStart"/>
+                        <w:r>
+                          <w:t>DescriptionCaption</w:t>
+                        </w:r>
+                        <w:proofErr w:type="spellEnd"/>
+                      </w:p>
+                    </w:tc>
+                  </w:sdtContent>
+                </w:sdt>
+                <w:sdt>
+                  <w:sdtPr>
+                    <w:alias w:val="#Nav: /Labels/Rental_DaysCaption"/>
+                    <w:tag w:val="#Nav: Bicycle_Rental_Report/50400"/>
+                    <w:id w:val="884998558"/>
+                    <w:placeholder>
+                      <w:docPart w:val="DefaultPlaceholder_-1854013440"/>
+                    </w:placeholder>
+                    <w:dataBinding w:prefixMappings="xmlns:ns0='urn:microsoft-dynamics-nav/reports/Bicycle_Rental_Report/50400/' " w:xpath="/ns0:NavWordReportXmlPart[1]/ns0:Labels[1]/ns0:Rental_DaysCaption[1]" w:storeItemID="{773EEAEE-57CF-46CA-BEB5-CD936B803A2D}"/>
+                    <w:text/>
+                  </w:sdtPr>
+                  <w:sdtContent>
+                    <w:tc>
+                      <w:tcPr>
+                        <w:tcW w:w="1701" w:type="dxa"/>
+                      </w:tcPr>
+                      <w:p>
+                        <w:pPr>
+                          <w:jc w:val="center"/>
+                        </w:pPr>
+                        <w:proofErr w:type="spellStart"/>
+                        <w:r>
+                          <w:t>Rental_DaysCaption</w:t>
+                        </w:r>
+                        <w:proofErr w:type="spellEnd"/>
+                      </w:p>
+                    </w:tc>
+                  </w:sdtContent>
+                </w:sdt>
+                <w:sdt>
+                  <w:sdtPr>
+                    <w:alias w:val="#Nav: /Labels/Daily_RateCaption"/>
+                    <w:tag w:val="#Nav: Bicycle_Rental_Report/50400"/>
+                    <w:id w:val="-360129310"/>
+                    <w:placeholder>
+                      <w:docPart w:val="DefaultPlaceholder_-1854013440"/>
+                    </w:placeholder>
+                    <w:dataBinding w:prefixMappings="xmlns:ns0='urn:microsoft-dynamics-nav/reports/Bicycle_Rental_Report/50400/' " w:xpath="/ns0:NavWordReportXmlPart[1]/ns0:Labels[1]/ns0:Daily_RateCaption[1]" w:storeItemID="{773EEAEE-57CF-46CA-BEB5-CD936B803A2D}"/>
+                    <w:text/>
+                  </w:sdtPr>
+                  <w:sdtContent>
+                    <w:tc>
+                      <w:tcPr>
+                        <w:tcW w:w="709" w:type="dxa"/>
+                      </w:tcPr>
+                      <w:p>
+                        <w:pPr>
+                          <w:jc w:val="center"/>
+                        </w:pPr>
+                        <w:proofErr w:type="spellStart"/>
+                        <w:r>
+                          <w:t>Daily_RateCaption</w:t>
+                        </w:r>
+                        <w:proofErr w:type="spellEnd"/>
+                      </w:p>
+                    </w:tc>
+                  </w:sdtContent>
+                </w:sdt>
+                <w:sdt>
+                  <w:sdtPr>
+                    <w:alias w:val="#Nav: /Labels/Line_AmountCaption"/>
+                    <w:tag w:val="#Nav: Bicycle_Rental_Report/50400"/>
+                    <w:id w:val="-642809030"/>
+                    <w:placeholder>
+                      <w:docPart w:val="DefaultPlaceholder_-1854013440"/>
+                    </w:placeholder>
+                    <w:dataBinding w:prefixMappings="xmlns:ns0='urn:microsoft-dynamics-nav/reports/Bicycle_Rental_Report/50400/' " w:xpath="/ns0:NavWordReportXmlPart[1]/ns0:Labels[1]/ns0:Line_AmountCaption[1]" w:storeItemID="{773EEAEE-57CF-46CA-BEB5-CD936B803A2D}"/>
+                    <w:text/>
+                  </w:sdtPr>
+                  <w:sdtContent>
+                    <w:tc>
+                      <w:tcPr>
+                        <w:tcW w:w="874" w:type="dxa"/>
+                      </w:tcPr>
+                      <w:p>
+                        <w:pPr>
+                          <w:jc w:val="center"/>
+                        </w:pPr>
+                        <w:proofErr w:type="spellStart"/>
+                        <w:r>
+                          <w:t>Line_AmountCaption</w:t>
+                        </w:r>
+                        <w:proofErr w:type="spellEnd"/>
+                      </w:p>
+                    </w:tc>
+                  </w:sdtContent>
+                </w:sdt>
+              </w:tr>
+              <w:sdt>
+                <w:sdtPr>
+                  <w:alias w:val="#Nav: /Customer/Rental_Header"/>
+                  <w:tag w:val="#Nav: Bicycle_Rental_Report/50400"/>
+                  <w:id w:val="1676619169"/>
+                  <w15:dataBinding w:prefixMappings="xmlns:ns0='urn:microsoft-dynamics-nav/reports/Bicycle_Rental_Report/50400/' " w:xpath="/ns0:NavWordReportXmlPart[1]/ns0:Customer[1]/ns0:Rental_Header" w:storeItemID="{773EEAEE-57CF-46CA-BEB5-CD936B803A2D}"/>
+                  <w15:repeatingSection/>
+                </w:sdtPr>
+                <w:sdtContent>
+                  <w:sdt>
+                    <w:sdtPr>
+                      <w:id w:val="-386110614"/>
+                      <w:placeholder>
+                        <w:docPart w:val="DefaultPlaceholder_-1854013435"/>
+                      </w:placeholder>
+                      <w15:repeatingSectionItem/>
+                    </w:sdtPr>
+                    <w:sdtContent>
+                      <w:tr>
+                        <w:sdt>
+                          <w:sdtPr>
+                            <w:alias w:val="#Nav: /Customer/Rental_Header/No_"/>
+                            <w:tag w:val="#Nav: Bicycle_Rental_Report/50400"/>
+                            <w:id w:val="588350103"/>
+                            <w:placeholder>
+                              <w:docPart w:val="DefaultPlaceholder_-1854013440"/>
+                            </w:placeholder>
+                            <w:dataBinding w:prefixMappings="xmlns:ns0='urn:microsoft-dynamics-nav/reports/Bicycle_Rental_Report/50400/' " w:xpath="/ns0:NavWordReportXmlPart[1]/ns0:Customer[1]/ns0:Rental_Header[1]/ns0:No_[1]" w:storeItemID="{773EEAEE-57CF-46CA-BEB5-CD936B803A2D}"/>
+                            <w:text/>
+                          </w:sdtPr>
+                          <w:sdtContent>
+                            <w:tc>
+                              <w:tcPr>
+                                <w:tcW w:w="988" w:type="dxa"/>
+                              </w:tcPr>
+                              <w:p>
+                                <w:pPr>
+                                  <w:jc w:val="center"/>
+                                </w:pPr>
+                                <w:r>
+                                  <w:t>No_</w:t>
+                                </w:r>
+                              </w:p>
+                            </w:tc>
+                          </w:sdtContent>
+                        </w:sdt>
+                        <w:sdt>
+                          <w:sdtPr>
+                            <w:alias w:val="#Nav: /Customer/Rental_Header/Rental_Date"/>
+                            <w:tag w:val="#Nav: Bicycle_Rental_Report/50400"/>
+                            <w:id w:val="1570774585"/>
+                            <w:placeholder>
+                              <w:docPart w:val="DefaultPlaceholder_-1854013440"/>
+                            </w:placeholder>
+                            <w:dataBinding w:prefixMappings="xmlns:ns0='urn:microsoft-dynamics-nav/reports/Bicycle_Rental_Report/50400/' " w:xpath="/ns0:NavWordReportXmlPart[1]/ns0:Customer[1]/ns0:Rental_Header[1]/ns0:Rental_Date[1]" w:storeItemID="{773EEAEE-57CF-46CA-BEB5-CD936B803A2D}"/>
+                            <w:text/>
+                          </w:sdtPr>
+                          <w:sdtContent>
+                            <w:tc>
+                              <w:tcPr>
+                                <w:tcW w:w="1701" w:type="dxa"/>
+                              </w:tcPr>
+                              <w:p>
+                                <w:pPr>
+                                  <w:jc w:val="center"/>
+                                </w:pPr>
+                                <w:proofErr w:type="spellStart"/>
+                                <w:r>
+                                  <w:t>Rental_Date</w:t>
+                                </w:r>
+                                <w:proofErr w:type="spellEnd"/>
+                              </w:p>
+                            </w:tc>
+                          </w:sdtContent>
+                        </w:sdt>
+                        <w:sdt>
+                          <w:sdtPr>
+                            <w:alias w:val="#Nav: /Customer/Rental_Header/Rental_Line/Bicycle_No_"/>
+                            <w:tag w:val="#Nav: Bicycle_Rental_Report/50400"/>
+                            <w:id w:val="1023128761"/>
+                            <w:placeholder>
+                              <w:docPart w:val="DefaultPlaceholder_-1854013440"/>
+                            </w:placeholder>
+                            <w:dataBinding w:prefixMappings="xmlns:ns0='urn:microsoft-dynamics-nav/reports/Bicycle_Rental_Report/50400/' " w:xpath="/ns0:NavWordReportXmlPart[1]/ns0:Customer[1]/ns0:Rental_Header[1]/ns0:Rental_Line[1]/ns0:Bicycle_No_[1]" w:storeItemID="{773EEAEE-57CF-46CA-BEB5-CD936B803A2D}"/>
+                            <w:text/>
+                          </w:sdtPr>
+                          <w:sdtContent>
+                            <w:tc>
+                              <w:tcPr>
+                                <w:tcW w:w="2126" w:type="dxa"/>
+                              </w:tcPr>
+                              <w:p>
+                                <w:pPr>
+                                  <w:jc w:val="center"/>
+                                </w:pPr>
+                                <w:proofErr w:type="spellStart"/>
+                                <w:r>
+                                  <w:t>Bicycle_No</w:t>
+                                </w:r>
+                                <w:proofErr w:type="spellEnd"/>
+                                <w:r>
+                                  <w:t>_</w:t>
+                                </w:r>
+                              </w:p>
+                            </w:tc>
+                          </w:sdtContent>
+                        </w:sdt>
+                        <w:sdt>
+                          <w:sdtPr>
+                            <w:alias w:val="#Nav: /Customer/Rental_Header/Rental_Line/Description"/>
+                            <w:tag w:val="#Nav: Bicycle_Rental_Report/50400"/>
+                            <w:id w:val="-494273641"/>
+                            <w:placeholder>
+                              <w:docPart w:val="DefaultPlaceholder_-1854013440"/>
+                            </w:placeholder>
+                            <w:dataBinding w:prefixMappings="xmlns:ns0='urn:microsoft-dynamics-nav/reports/Bicycle_Rental_Report/50400/' " w:xpath="/ns0:NavWordReportXmlPart[1]/ns0:Customer[1]/ns0:Rental_Header[1]/ns0:Rental_Line[1]/ns0:Description[1]" w:storeItemID="{773EEAEE-57CF-46CA-BEB5-CD936B803A2D}"/>
+                            <w:text/>
+                          </w:sdtPr>
+                          <w:sdtContent>
+                            <w:tc>
+                              <w:tcPr>
+                                <w:tcW w:w="1559" w:type="dxa"/>
+                              </w:tcPr>
+                              <w:p>
+                                <w:pPr>
+                                  <w:jc w:val="center"/>
+                                </w:pPr>
+                                <w:proofErr w:type="spellStart"/>
+                                <w:r>
+                                  <w:t>Description</w:t>
+                                </w:r>
+                                <w:proofErr w:type="spellEnd"/>
+                              </w:p>
+                            </w:tc>
+                          </w:sdtContent>
+                        </w:sdt>
+                        <w:sdt>
+                          <w:sdtPr>
+                            <w:alias w:val="#Nav: /Customer/Rental_Header/Rental_Line/Rental_Days"/>
+                            <w:tag w:val="#Nav: Bicycle_Rental_Report/50400"/>
+                            <w:id w:val="-21866291"/>
+                            <w:placeholder>
+                              <w:docPart w:val="DefaultPlaceholder_-1854013440"/>
+                            </w:placeholder>
+                            <w:dataBinding w:prefixMappings="xmlns:ns0='urn:microsoft-dynamics-nav/reports/Bicycle_Rental_Report/50400/' " w:xpath="/ns0:NavWordReportXmlPart[1]/ns0:Customer[1]/ns0:Rental_Header[1]/ns0:Rental_Line[1]/ns0:Rental_Days[1]" w:storeItemID="{773EEAEE-57CF-46CA-BEB5-CD936B803A2D}"/>
+                            <w:text/>
+                          </w:sdtPr>
+                          <w:sdtContent>
+                            <w:tc>
+                              <w:tcPr>
+                                <w:tcW w:w="1701" w:type="dxa"/>
+                              </w:tcPr>
+                              <w:p>
+                                <w:pPr>
+                                  <w:jc w:val="center"/>
+                                </w:pPr>
+                                <w:proofErr w:type="spellStart"/>
+                                <w:r>
+                                  <w:t>Rental_Days</w:t>
+                                </w:r>
+                                <w:proofErr w:type="spellEnd"/>
+                              </w:p>
+                            </w:tc>
+                          </w:sdtContent>
+                        </w:sdt>
+                        <w:sdt>
+                          <w:sdtPr>
+                            <w:alias w:val="#Nav: /Customer/Rental_Header/Rental_Line/Daily_Rate"/>
+                            <w:tag w:val="#Nav: Bicycle_Rental_Report/50400"/>
+                            <w:id w:val="-1720119634"/>
+                            <w:placeholder>
+                              <w:docPart w:val="DefaultPlaceholder_-1854013440"/>
+                            </w:placeholder>
+                            <w:dataBinding w:prefixMappings="xmlns:ns0='urn:microsoft-dynamics-nav/reports/Bicycle_Rental_Report/50400/' " w:xpath="/ns0:NavWordReportXmlPart[1]/ns0:Customer[1]/ns0:Rental_Header[1]/ns0:Rental_Line[1]/ns0:Daily_Rate[1]" w:storeItemID="{773EEAEE-57CF-46CA-BEB5-CD936B803A2D}"/>
+                            <w:text/>
+                          </w:sdtPr>
+                          <w:sdtContent>
+                            <w:tc>
+                              <w:tcPr>
+                                <w:tcW w:w="709" w:type="dxa"/>
+                              </w:tcPr>
+                              <w:p>
+                                <w:pPr>
+                                  <w:jc w:val="center"/>
+                                </w:pPr>
+                                <w:proofErr w:type="spellStart"/>
+                                <w:r>
+                                  <w:t>Daily_Rate</w:t>
+                                </w:r>
+                                <w:proofErr w:type="spellEnd"/>
+                              </w:p>
+                            </w:tc>
+                          </w:sdtContent>
+                        </w:sdt>
+                        <w:sdt>
+                          <w:sdtPr>
+                            <w:alias w:val="#Nav: /Customer/Rental_Header/Rental_Line/Line_Amount"/>
+                            <w:tag w:val="#Nav: Bicycle_Rental_Report/50400"/>
+                            <w:id w:val="-2084669519"/>
+                            <w:placeholder>
+                              <w:docPart w:val="DefaultPlaceholder_-1854013440"/>
+                            </w:placeholder>
+                            <w:dataBinding w:prefixMappings="xmlns:ns0='urn:microsoft-dynamics-nav/reports/Bicycle_Rental_Report/50400/' " w:xpath="/ns0:NavWordReportXmlPart[1]/ns0:Customer[1]/ns0:Rental_Header[1]/ns0:Rental_Line[1]/ns0:Line_Amount[1]" w:storeItemID="{773EEAEE-57CF-46CA-BEB5-CD936B803A2D}"/>
+                            <w:text/>
+                          </w:sdtPr>
+                          <w:sdtContent>
+                            <w:tc>
+                              <w:tcPr>
+                                <w:tcW w:w="874" w:type="dxa"/>
+                              </w:tcPr>
+                              <w:p>
+                                <w:pPr>
+                                  <w:jc w:val="center"/>
+                                </w:pPr>
+                                <w:proofErr w:type="spellStart"/>
+                                <w:r>
+                                  <w:t>Line_Amount</w:t>
+                                </w:r>
+                                <w:proofErr w:type="spellEnd"/>
+                              </w:p>
+                            </w:tc>
+                          </w:sdtContent>
+                        </w:sdt>
+                      </w:tr>
+                    </w:sdtContent>
+                  </w:sdt>
+                </w:sdtContent>
+              </w:sdt>
+            </w:tbl>
+          </w:sdtContent>
+        </w:sdt>
+      </w:sdtContent>
+    </w:sdt>
     <w:p>
       <w:pPr>
         <w:jc w:val="center"/>
@@ -1030,12 +1248,17 @@
     <w:rsidRoot w:val="0089159B"/>
     <w:rsid w:val="0018512B"/>
     <w:rsid w:val="00391F6D"/>
+    <w:rsid w:val="005E4C07"/>
     <w:rsid w:val="0089159B"/>
     <w:rsid w:val="00B34C41"/>
     <w:rsid w:val="00B6286E"/>
+    <w:rsid w:val="00C56A49"/>
     <w:rsid w:val="00C62CE8"/>
     <w:rsid w:val="00CD5D12"/>
     <w:rsid w:val="00D03AC9"/>
+    <w:rsid w:val="00E0501E"/>
+    <w:rsid w:val="00E81B84"/>
+    <w:rsid w:val="00EA21AC"/>
     <w:rsid w:val="00F074CD"/>
     <w:rsid w:val="00F24C45"/>
   </w:rsids>
@@ -1493,7 +1716,7 @@
     <w:basedOn w:val="Privzetapisavaodstavka"/>
     <w:uiPriority w:val="99"/>
     <w:semiHidden/>
-    <w:rsid w:val="00D03AC9"/>
+    <w:rsid w:val="00E81B84"/>
     <w:rPr>
       <w:color w:val="666666"/>
     </w:rPr>
@@ -1803,7 +2026,7 @@
 </a:theme>
 </file>
 
-<file path=customXml/item1.xml>��< ? x m l   v e r s i o n = " 1 . 0 "   e n c o d i n g = " u t f - 1 6 " ? > < N a v W o r d R e p o r t X m l P a r t   x m l n s = " u r n : m i c r o s o f t - d y n a m i c s - n a v / r e p o r t s / B i c y c l e _ R e n t a l _ R e p o r t / 5 0 4 0 0 / " > +<file path=customXml/item1.xml>��< ? x m l   v e r s i o n = " 1 . 0 "   e n c o d i n g = " u t f - 1 6 " ? > < N a v W o r d R e p o r t X m l P a r t   x m l n s = " u r n : m i c r o s o f t - d y n a m i c s - b u s i n e s s c e n t r a l / i n t e r n a l / e x t e n d e d / r e p o r t s / B i c y c l e _ R e n t a l _ R e p o r t / 5 0 4 0 0 / " >   
      < B C R e p o r t I n f o r m a t i o n >   
@@ -1871,61 +2094,81 @@
  
      < L a b e l s >   
-         < A c t u a l _ R e t u r n _ D a t e C a p t i o n > A c t u a l _ R e t u r n _ D a t e C a p t i o n < / A c t u a l _ R e t u r n _ D a t e C a p t i o n > - 
-         < B i c y c l e _ N o _ C a p t i o n > B i c y c l e _ N o _ C a p t i o n < / B i c y c l e _ N o _ C a p t i o n > - 
-         < D a i l y _ R a t e C a p t i o n > D a i l y _ R a t e C a p t i o n < / D a i l y _ R a t e C a p t i o n > - 
-         < D e s c r i p t i o n C a p t i o n > D e s c r i p t i o n C a p t i o n < / D e s c r i p t i o n C a p t i o n > - 
-         < E x p e c t e d _ R e t u r n _ D a t e C a p t i o n > E x p e c t e d _ R e t u r n _ D a t e C a p t i o n < / E x p e c t e d _ R e t u r n _ D a t e C a p t i o n > - 
-         < L i n e _ A m o u n t C a p t i o n > L i n e _ A m o u n t C a p t i o n < / L i n e _ A m o u n t C a p t i o n > - 
-         < N o _ C a p t i o n > N o _ C a p t i o n < / N o _ C a p t i o n > - 
-         < R e n t a l _ D a t e C a p t i o n > R e n t a l _ D a t e C a p t i o n < / R e n t a l _ D a t e C a p t i o n > - 
-         < R e n t a l _ D a y s C a p t i o n > R e n t a l _ D a y s C a p t i o n < / R e n t a l _ D a y s C a p t i o n > - 
-         < R e p o r t T i t l e > R e p o r t T i t l e < / R e p o r t T i t l e > - 
-         < S t a t u s C a p t i o n > S t a t u s C a p t i o n < / S t a t u s C a p t i o n > +         < A c t u a l _ R e t u r n _ D a t e C a p t i o n   E l e m e n t T y p e = " P a r a m e t e r "   E l e m e n t I d = " 1 0 1 0 7 6 2 7 6 5 "   D a t a T y p e = " S t r i n g " > A c t u a l _ R e t u r n _ D a t e C a p t i o n < / A c t u a l _ R e t u r n _ D a t e C a p t i o n > + 
+         < B i c y c l e _ N o _ C a p t i o n   E l e m e n t T y p e = " P a r a m e t e r "   E l e m e n t I d = " 1 3 0 1 0 8 3 7 8 5 "   D a t a T y p e = " S t r i n g " > B i c y c l e _ N o _ C a p t i o n < / B i c y c l e _ N o _ C a p t i o n > + 
+         < C u s t o m e r N a m e C a p t i o n   E l e m e n t T y p e = " P a r a m e t e r "   E l e m e n t I d = " 2 6 5 4 9 6 8 2 6 "   D a t a T y p e = " S t r i n g " > C u s t o m e r N a m e C a p t i o n < / C u s t o m e r N a m e C a p t i o n > + 
+         < C u s t o m e r N o _ C a p t i o n   E l e m e n t T y p e = " P a r a m e t e r "   E l e m e n t I d = " 8 9 5 0 3 9 8 5 "   D a t a T y p e = " S t r i n g " > C u s t o m e r N o _ C a p t i o n < / C u s t o m e r N o _ C a p t i o n > + 
+         < D a i l y _ R a t e C a p t i o n   E l e m e n t T y p e = " P a r a m e t e r "   E l e m e n t I d = " 7 4 3 0 3 2 7 1 9 "   D a t a T y p e = " S t r i n g " > D a i l y _ R a t e C a p t i o n < / D a i l y _ R a t e C a p t i o n > + 
+         < D e s c r i p t i o n C a p t i o n   E l e m e n t T y p e = " P a r a m e t e r "   E l e m e n t I d = " 1 3 1 4 3 5 1 3 0 7 "   D a t a T y p e = " S t r i n g " > D e s c r i p t i o n C a p t i o n < / D e s c r i p t i o n C a p t i o n > + 
+         < E x p e c t e d _ R e t u r n _ D a t e C a p t i o n   E l e m e n t T y p e = " P a r a m e t e r "   E l e m e n t I d = " 1 9 3 0 8 5 9 1 5 "   D a t a T y p e = " S t r i n g " > E x p e c t e d _ R e t u r n _ D a t e C a p t i o n < / E x p e c t e d _ R e t u r n _ D a t e C a p t i o n > + 
+         < L i n e _ A m o u n t C a p t i o n   E l e m e n t T y p e = " P a r a m e t e r "   E l e m e n t I d = " 1 6 1 7 1 7 1 8 0 0 "   D a t a T y p e = " S t r i n g " > L i n e _ A m o u n t C a p t i o n < / L i n e _ A m o u n t C a p t i o n > + 
+         < N o _ C a p t i o n   E l e m e n t T y p e = " P a r a m e t e r "   E l e m e n t I d = " 1 0 8 0 6 9 1 2 5 3 "   D a t a T y p e = " S t r i n g " > N o _ C a p t i o n < / N o _ C a p t i o n > + 
+         < R e n t a l _ D a t e C a p t i o n   E l e m e n t T y p e = " P a r a m e t e r "   E l e m e n t I d = " 1 5 0 8 5 7 0 5 0 2 "   D a t a T y p e = " S t r i n g " > R e n t a l _ D a t e C a p t i o n < / R e n t a l _ D a t e C a p t i o n > + 
+         < R e n t a l _ D a y s C a p t i o n   E l e m e n t T y p e = " P a r a m e t e r "   E l e m e n t I d = " 1 8 5 9 4 2 2 4 3 5 "   D a t a T y p e = " S t r i n g " > R e n t a l _ D a y s C a p t i o n < / R e n t a l _ D a y s C a p t i o n > + 
+         < R e p o r t T i t l e   E l e m e n t T y p e = " P a r a m e t e r "   E l e m e n t I d = " 1 4 7 9 0 2 5 3 9 "   D a t a T y p e = " S t r i n g " > R e p o r t T i t l e < / R e p o r t T i t l e > + 
+         < S t a t u s C a p t i o n   E l e m e n t T y p e = " P a r a m e t e r "   E l e m e n t I d = " 1 6 3 4 1 4 4 5 5 1 "   D a t a T y p e = " S t r i n g " > S t a t u s C a p t i o n < / S t a t u s C a p t i o n >   
      < / L a b e l s >   
-     < C u s t o m e r > - 
-         < C u r r e n t D a t e _ > C u r r e n t D a t e _ < / C u r r e n t D a t e _ > - 
-         < C u s t o m e r N a m e > C u s t o m e r N a m e < / C u s t o m e r N a m e > - 
-         < C u s t o m e r N o _ > C u s t o m e r N o _ < / C u s t o m e r N o _ > - 
-         < R e n t a l _ H e a d e r > - 
-             < A c t u a l _ R e t u r n _ D a t e > A c t u a l _ R e t u r n _ D a t e < / A c t u a l _ R e t u r n _ D a t e > - 
-             < E x p e c t e d _ R e t u r n _ D a t e > E x p e c t e d _ R e t u r n _ D a t e < / E x p e c t e d _ R e t u r n _ D a t e > - 
-             < N o _ > N o _ < / N o _ > - 
-             < R e n t a l _ D a t e > R e n t a l _ D a t e < / R e n t a l _ D a t e > - 
-             < S t a t u s > S t a t u s < / S t a t u s > - 
-             < R e n t a l _ L i n e > - 
-                 < B i c y c l e _ N o _ > B i c y c l e _ N o _ < / B i c y c l e _ N o _ > - 
-                 < D a i l y _ R a t e > D a i l y _ R a t e < / D a i l y _ R a t e > - 
-                 < D e s c r i p t i o n > D e s c r i p t i o n < / D e s c r i p t i o n > - 
-                 < L i n e _ A m o u n t > L i n e _ A m o u n t < / L i n e _ A m o u n t > - 
-                 < R e n t a l _ D a y s > R e n t a l _ D a y s < / R e n t a l _ D a y s > +     < T o o l t i p s > + 
+         < T o o l t i p   c o l u m n = " C u s t o m e r N o _ "   E l e m e n t I d = " 8 9 5 0 3 9 8 5 " > + 
+             < T o o l t i p T e x t   l a n g = " e n - U S " > S p e c i f i e s   t h e   n u m b e r   o f   t h e   c u s t o m e r .   T h e   f i e l d   i s   e i t h e r   f i l l e d   a u t o m a t i c a l l y   f r o m   a   d e f i n e d   n u m b e r   s e r i e s ,   o r   y o u   e n t e r   t h e   n u m b e r   m a n u a l l y   b e c a u s e   y o u   h a v e   e n a b l e d   m a n u a l   n u m b e r   e n t r y   i n   t h e   n u m b e r - s e r i e s   s e t u p . < / T o o l t i p T e x t > + 
+         < / T o o l t i p > + 
+         < T o o l t i p   c o l u m n = " C u s t o m e r N a m e "   E l e m e n t I d = " 2 6 5 4 9 6 8 2 6 " > + 
+             < T o o l t i p T e x t   l a n g = " e n - U S " > S p e c i f i e s   t h e   c u s t o m e r ' s   n a m e   t h a t   a p p e a r s   o n   a l l   r e l a t e d   d o c u m e n t s .   F o r   c o m p a n i e s ,   s p e c i f y   t h e   c o m p a n y ' s   n a m e   h e r e ,   a n d   t h e n   a d d   t h e   r e l e v a n t   p e o p l e   a s   c o n t a c t s   t h a t   y o u   l i n k   t o   t h i s   c u s t o m e r . < / T o o l t i p T e x t > + 
+         < / T o o l t i p > + 
+     < / T o o l t i p s > + 
+     < C u s t o m e r   E l e m e n t T y p e = " D a t a I t e m "   E l e m e n t I d = " 1 5 2 5 1 9 1 9 9 " > + 
+         < C u r r e n t D a t e _   E l e m e n t T y p e = " C o l u m n "   E l e m e n t I d = " 4 7 8 2 7 1 8 6 5 "   D a t a T y p e = " D a t e " > C u r r e n t D a t e _ < / C u r r e n t D a t e _ > + 
+         < C u s t o m e r N a m e   E l e m e n t T y p e = " C o l u m n "   E l e m e n t I d = " 2 6 5 4 9 6 8 2 6 "   D a t a T y p e = " T e x t " > C u s t o m e r N a m e < / C u s t o m e r N a m e > + 
+         < C u s t o m e r N o _   E l e m e n t T y p e = " C o l u m n "   E l e m e n t I d = " 8 9 5 0 3 9 8 5 "   D a t a T y p e = " C o d e " > C u s t o m e r N o _ < / C u s t o m e r N o _ > + 
+         < R e n t a l _ H e a d e r   E l e m e n t T y p e = " D a t a I t e m "   E l e m e n t I d = " 6 5 8 2 2 0 6 9 9 " > + 
+             < A c t u a l _ R e t u r n _ D a t e   E l e m e n t T y p e = " C o l u m n "   E l e m e n t I d = " 1 0 1 0 7 6 2 7 6 5 "   D a t a T y p e = " D a t e " > A c t u a l _ R e t u r n _ D a t e < / A c t u a l _ R e t u r n _ D a t e > + 
+             < E x p e c t e d _ R e t u r n _ D a t e   E l e m e n t T y p e = " C o l u m n "   E l e m e n t I d = " 1 9 3 0 8 5 9 1 5 "   D a t a T y p e = " D a t e " > E x p e c t e d _ R e t u r n _ D a t e < / E x p e c t e d _ R e t u r n _ D a t e > + 
+             < N o _   E l e m e n t T y p e = " C o l u m n "   E l e m e n t I d = " 1 0 8 0 6 9 1 2 5 3 "   D a t a T y p e = " I n t e g e r " > N o _ < / N o _ > + 
+             < R e n t a l _ D a t e   E l e m e n t T y p e = " C o l u m n "   E l e m e n t I d = " 1 5 0 8 5 7 0 5 0 2 "   D a t a T y p e = " D a t e " > R e n t a l _ D a t e < / R e n t a l _ D a t e > + 
+             < S t a t u s   E l e m e n t T y p e = " C o l u m n "   E l e m e n t I d = " 1 6 3 4 1 4 4 5 5 1 "   D a t a T y p e = " E n u m " > S t a t u s < / S t a t u s > + 
+             < R e n t a l _ L i n e   E l e m e n t T y p e = " D a t a I t e m "   E l e m e n t I d = " 7 2 9 8 0 6 3 8 8 " > + 
+                 < B i c y c l e _ N o _   E l e m e n t T y p e = " C o l u m n "   E l e m e n t I d = " 1 3 0 1 0 8 3 7 8 5 "   D a t a T y p e = " C o d e " > B i c y c l e _ N o _ < / B i c y c l e _ N o _ > + 
+                 < D a i l y _ R a t e   E l e m e n t T y p e = " C o l u m n "   E l e m e n t I d = " 7 4 3 0 3 2 7 1 9 "   D a t a T y p e = " D e c i m a l " > D a i l y _ R a t e < / D a i l y _ R a t e > + 
+                 < D e s c r i p t i o n   E l e m e n t T y p e = " C o l u m n "   E l e m e n t I d = " 1 3 1 4 3 5 1 3 0 7 "   D a t a T y p e = " T e x t " > D e s c r i p t i o n < / D e s c r i p t i o n > + 
+                 < L i n e _ A m o u n t   E l e m e n t T y p e = " C o l u m n "   E l e m e n t I d = " 1 6 1 7 1 7 1 8 0 0 "   D a t a T y p e = " D e c i m a l " > L i n e _ A m o u n t < / L i n e _ A m o u n t > + 
+                 < R e n t a l _ D a y s   E l e m e n t T y p e = " C o l u m n "   E l e m e n t I d = " 1 8 5 9 4 2 2 4 3 5 "   D a t a T y p e = " I n t e g e r " > R e n t a l _ D a y s < / R e n t a l _ D a y s >   
              < / R e n t a l _ L i n e >   
@@ -1936,7 +2179,9 @@
  < / N a v W o r d R e p o r t X m l P a r t > 
 </file>
 
-<file path=customXml/item2.xml>��< ? x m l   v e r s i o n = " 1 . 0 "   e n c o d i n g = " u t f - 1 6 " ? > < N a v W o r d R e p o r t X m l P a r t   x m l n s = " u r n : m i c r o s o f t - d y n a m i c s - b u s i n e s s c e n t r a l / i n t e r n a l / e x t e n d e d / r e p o r t s / B i c y c l e _ R e n t a l _ R e p o r t / 5 0 4 0 0 / " > +<file path=customXml/item2.xml>��< ? x m l   v e r s i o n = " 1 . 0 "   e n c o d i n g = " u t f - 1 6 " ? > + 
+ < N a v W o r d R e p o r t X m l P a r t   x m l n s = " u r n : m i c r o s o f t - d y n a m i c s - n a v / r e p o r t s / B i c y c l e _ R e n t a l _ R e p o r t / 5 0 4 0 0 / " >   
      < B C R e p o r t I n f o r m a t i o n >   
@@ -2004,77 +2249,65 @@
  
      < L a b e l s >   
-         < A c t u a l _ R e t u r n _ D a t e C a p t i o n   E l e m e n t T y p e = " P a r a m e t e r "   E l e m e n t I d = " 1 0 1 0 7 6 2 7 6 5 "   D a t a T y p e = " S t r i n g " > A c t u a l _ R e t u r n _ D a t e C a p t i o n < / A c t u a l _ R e t u r n _ D a t e C a p t i o n > - 
-         < B i c y c l e _ N o _ C a p t i o n   E l e m e n t T y p e = " P a r a m e t e r "   E l e m e n t I d = " 1 3 0 1 0 8 3 7 8 5 "   D a t a T y p e = " S t r i n g " > B i c y c l e _ N o _ C a p t i o n < / B i c y c l e _ N o _ C a p t i o n > - 
-         < D a i l y _ R a t e C a p t i o n   E l e m e n t T y p e = " P a r a m e t e r "   E l e m e n t I d = " 7 4 3 0 3 2 7 1 9 "   D a t a T y p e = " S t r i n g " > D a i l y _ R a t e C a p t i o n < / D a i l y _ R a t e C a p t i o n > - 
-         < D e s c r i p t i o n C a p t i o n   E l e m e n t T y p e = " P a r a m e t e r "   E l e m e n t I d = " 1 3 1 4 3 5 1 3 0 7 "   D a t a T y p e = " S t r i n g " > D e s c r i p t i o n C a p t i o n < / D e s c r i p t i o n C a p t i o n > - 
-         < E x p e c t e d _ R e t u r n _ D a t e C a p t i o n   E l e m e n t T y p e = " P a r a m e t e r "   E l e m e n t I d = " 1 9 3 0 8 5 9 1 5 "   D a t a T y p e = " S t r i n g " > E x p e c t e d _ R e t u r n _ D a t e C a p t i o n < / E x p e c t e d _ R e t u r n _ D a t e C a p t i o n > - 
-         < L i n e _ A m o u n t C a p t i o n   E l e m e n t T y p e = " P a r a m e t e r "   E l e m e n t I d = " 1 6 1 7 1 7 1 8 0 0 "   D a t a T y p e = " S t r i n g " > L i n e _ A m o u n t C a p t i o n < / L i n e _ A m o u n t C a p t i o n > - 
-         < N o _ C a p t i o n   E l e m e n t T y p e = " P a r a m e t e r "   E l e m e n t I d = " 1 0 8 0 6 9 1 2 5 3 "   D a t a T y p e = " S t r i n g " > N o _ C a p t i o n < / N o _ C a p t i o n > - 
-         < R e n t a l _ D a t e C a p t i o n   E l e m e n t T y p e = " P a r a m e t e r "   E l e m e n t I d = " 1 5 0 8 5 7 0 5 0 2 "   D a t a T y p e = " S t r i n g " > R e n t a l _ D a t e C a p t i o n < / R e n t a l _ D a t e C a p t i o n > - 
-         < R e n t a l _ D a y s C a p t i o n   E l e m e n t T y p e = " P a r a m e t e r "   E l e m e n t I d = " 1 8 5 9 4 2 2 4 3 5 "   D a t a T y p e = " S t r i n g " > R e n t a l _ D a y s C a p t i o n < / R e n t a l _ D a y s C a p t i o n > - 
-         < R e p o r t T i t l e   E l e m e n t T y p e = " P a r a m e t e r "   E l e m e n t I d = " 1 4 7 9 0 2 5 3 9 "   D a t a T y p e = " S t r i n g " > R e p o r t T i t l e < / R e p o r t T i t l e > - 
-         < S t a t u s C a p t i o n   E l e m e n t T y p e = " P a r a m e t e r "   E l e m e n t I d = " 1 6 3 4 1 4 4 5 5 1 "   D a t a T y p e = " S t r i n g " > S t a t u s C a p t i o n < / S t a t u s C a p t i o n > +         < A c t u a l _ R e t u r n _ D a t e C a p t i o n > A c t u a l _ R e t u r n _ D a t e C a p t i o n < / A c t u a l _ R e t u r n _ D a t e C a p t i o n > + 
+         < B i c y c l e _ N o _ C a p t i o n > B i c y c l e _ N o _ C a p t i o n < / B i c y c l e _ N o _ C a p t i o n > + 
+         < C u s t o m e r N a m e C a p t i o n > C u s t o m e r N a m e C a p t i o n < / C u s t o m e r N a m e C a p t i o n > + 
+         < C u s t o m e r N o _ C a p t i o n > C u s t o m e r N o _ C a p t i o n < / C u s t o m e r N o _ C a p t i o n > + 
+         < D a i l y _ R a t e C a p t i o n > D a i l y _ R a t e C a p t i o n < / D a i l y _ R a t e C a p t i o n > + 
+         < D e s c r i p t i o n C a p t i o n > D e s c r i p t i o n C a p t i o n < / D e s c r i p t i o n C a p t i o n > + 
+         < E x p e c t e d _ R e t u r n _ D a t e C a p t i o n > E x p e c t e d _ R e t u r n _ D a t e C a p t i o n < / E x p e c t e d _ R e t u r n _ D a t e C a p t i o n > + 
+         < L i n e _ A m o u n t C a p t i o n > L i n e _ A m o u n t C a p t i o n < / L i n e _ A m o u n t C a p t i o n > + 
+         < N o _ C a p t i o n > N o _ C a p t i o n < / N o _ C a p t i o n > + 
+         < R e n t a l _ D a t e C a p t i o n > R e n t a l _ D a t e C a p t i o n < / R e n t a l _ D a t e C a p t i o n > + 
+         < R e n t a l _ D a y s C a p t i o n > R e n t a l _ D a y s C a p t i o n < / R e n t a l _ D a y s C a p t i o n > + 
+         < R e p o r t T i t l e > R e p o r t T i t l e < / R e p o r t T i t l e > + 
+         < S t a t u s C a p t i o n > S t a t u s C a p t i o n < / S t a t u s C a p t i o n >   
      < / L a b e l s >   
-     < T o o l t i p s > - 
-         < T o o l t i p   c o l u m n = " C u s t o m e r N o _ "   E l e m e n t I d = " 8 9 5 0 3 9 8 5 " > - 
-             < T o o l t i p T e x t   l a n g = " e n - U S " > S p e c i f i e s   t h e   n u m b e r   o f   t h e   c u s t o m e r .   T h e   f i e l d   i s   e i t h e r   f i l l e d   a u t o m a t i c a l l y   f r o m   a   d e f i n e d   n u m b e r   s e r i e s ,   o r   y o u   e n t e r   t h e   n u m b e r   m a n u a l l y   b e c a u s e   y o u   h a v e   e n a b l e d   m a n u a l   n u m b e r   e n t r y   i n   t h e   n u m b e r - s e r i e s   s e t u p . < / T o o l t i p T e x t > - 
-         < / T o o l t i p > - 
-         < T o o l t i p   c o l u m n = " C u s t o m e r N a m e "   E l e m e n t I d = " 2 6 5 4 9 6 8 2 6 " > - 
-             < T o o l t i p T e x t   l a n g = " e n - U S " > S p e c i f i e s   t h e   c u s t o m e r ' s   n a m e   t h a t   a p p e a r s   o n   a l l   r e l a t e d   d o c u m e n t s .   F o r   c o m p a n i e s ,   s p e c i f y   t h e   c o m p a n y ' s   n a m e   h e r e ,   a n d   t h e n   a d d   t h e   r e l e v a n t   p e o p l e   a s   c o n t a c t s   t h a t   y o u   l i n k   t o   t h i s   c u s t o m e r . < / T o o l t i p T e x t > - 
-         < / T o o l t i p > - 
-     < / T o o l t i p s > - 
-     < C u s t o m e r   E l e m e n t T y p e = " D a t a I t e m "   E l e m e n t I d = " 1 5 2 5 1 9 1 9 9 " > - 
-         < C u r r e n t D a t e _   E l e m e n t T y p e = " C o l u m n "   E l e m e n t I d = " 4 7 8 2 7 1 8 6 5 "   D a t a T y p e = " D a t e " > C u r r e n t D a t e _ < / C u r r e n t D a t e _ > - 
-         < C u s t o m e r N a m e   E l e m e n t T y p e = " C o l u m n "   E l e m e n t I d = " 2 6 5 4 9 6 8 2 6 "   D a t a T y p e = " T e x t " > C u s t o m e r N a m e < / C u s t o m e r N a m e > - 
-         < C u s t o m e r N o _   E l e m e n t T y p e = " C o l u m n "   E l e m e n t I d = " 8 9 5 0 3 9 8 5 "   D a t a T y p e = " C o d e " > C u s t o m e r N o _ < / C u s t o m e r N o _ > - 
-         < R e n t a l _ H e a d e r   E l e m e n t T y p e = " D a t a I t e m "   E l e m e n t I d = " 6 5 8 2 2 0 6 9 9 " > - 
-             < A c t u a l _ R e t u r n _ D a t e   E l e m e n t T y p e = " C o l u m n "   E l e m e n t I d = " 1 0 1 0 7 6 2 7 6 5 "   D a t a T y p e = " D a t e " > A c t u a l _ R e t u r n _ D a t e < / A c t u a l _ R e t u r n _ D a t e > - 
-             < E x p e c t e d _ R e t u r n _ D a t e   E l e m e n t T y p e = " C o l u m n "   E l e m e n t I d = " 1 9 3 0 8 5 9 1 5 "   D a t a T y p e = " D a t e " > E x p e c t e d _ R e t u r n _ D a t e < / E x p e c t e d _ R e t u r n _ D a t e > - 
-             < N o _   E l e m e n t T y p e = " C o l u m n "   E l e m e n t I d = " 1 0 8 0 6 9 1 2 5 3 "   D a t a T y p e = " I n t e g e r " > N o _ < / N o _ > - 
-             < R e n t a l _ D a t e   E l e m e n t T y p e = " C o l u m n "   E l e m e n t I d = " 1 5 0 8 5 7 0 5 0 2 "   D a t a T y p e = " D a t e " > R e n t a l _ D a t e < / R e n t a l _ D a t e > - 
-             < S t a t u s   E l e m e n t T y p e = " C o l u m n "   E l e m e n t I d = " 1 6 3 4 1 4 4 5 5 1 "   D a t a T y p e = " E n u m " > S t a t u s < / S t a t u s > - 
-             < R e n t a l _ L i n e   E l e m e n t T y p e = " D a t a I t e m "   E l e m e n t I d = " 7 2 9 8 0 6 3 8 8 " > - 
-                 < B i c y c l e _ N o _   E l e m e n t T y p e = " C o l u m n "   E l e m e n t I d = " 1 3 0 1 0 8 3 7 8 5 "   D a t a T y p e = " C o d e " > B i c y c l e _ N o _ < / B i c y c l e _ N o _ > - 
-                 < D a i l y _ R a t e   E l e m e n t T y p e = " C o l u m n "   E l e m e n t I d = " 7 4 3 0 3 2 7 1 9 "   D a t a T y p e = " D e c i m a l " > D a i l y _ R a t e < / D a i l y _ R a t e > - 
-                 < D e s c r i p t i o n   E l e m e n t T y p e = " C o l u m n "   E l e m e n t I d = " 1 3 1 4 3 5 1 3 0 7 "   D a t a T y p e = " T e x t " > D e s c r i p t i o n < / D e s c r i p t i o n > - 
-                 < L i n e _ A m o u n t   E l e m e n t T y p e = " C o l u m n "   E l e m e n t I d = " 1 6 1 7 1 7 1 8 0 0 "   D a t a T y p e = " D e c i m a l " > L i n e _ A m o u n t < / L i n e _ A m o u n t > - 
-                 < R e n t a l _ D a y s   E l e m e n t T y p e = " C o l u m n "   E l e m e n t I d = " 1 8 5 9 4 2 2 4 3 5 "   D a t a T y p e = " I n t e g e r " > R e n t a l _ D a y s < / R e n t a l _ D a y s > +     < C u s t o m e r > + 
+         < C u r r e n t D a t e _ > C u r r e n t D a t e _ < / C u r r e n t D a t e _ > + 
+         < C u s t o m e r N a m e > C u s t o m e r N a m e < / C u s t o m e r N a m e > + 
+         < C u s t o m e r N o _ > C u s t o m e r N o _ < / C u s t o m e r N o _ > + 
+         < R e n t a l _ H e a d e r > + 
+             < A c t u a l _ R e t u r n _ D a t e > A c t u a l _ R e t u r n _ D a t e < / A c t u a l _ R e t u r n _ D a t e > + 
+             < E x p e c t e d _ R e t u r n _ D a t e > E x p e c t e d _ R e t u r n _ D a t e < / E x p e c t e d _ R e t u r n _ D a t e > + 
+             < N o _ > N o _ < / N o _ > + 
+             < R e n t a l _ D a t e > R e n t a l _ D a t e < / R e n t a l _ D a t e > + 
+             < S t a t u s > S t a t u s < / S t a t u s > + 
+             < R e n t a l _ L i n e > + 
+                 < B i c y c l e _ N o _ > B i c y c l e _ N o _ < / B i c y c l e _ N o _ > + 
+                 < D a i l y _ R a t e > D a i l y _ R a t e < / D a i l y _ R a t e > + 
+                 < D e s c r i p t i o n > D e s c r i p t i o n < / D e s c r i p t i o n > + 
+                 < L i n e _ A m o u n t > L i n e _ A m o u n t < / L i n e _ A m o u n t > + 
+                 < R e n t a l _ D a y s > R e n t a l _ D a y s < / R e n t a l _ D a y s >   
              < / R e n t a l _ L i n e >   
@@ -2086,17 +2319,17 @@
 </file>
 
 <file path=customXml/itemProps1.xml><?xml version="1.0" encoding="utf-8"?>
+<ds:datastoreItem xmlns:ds="http://schemas.openxmlformats.org/officeDocument/2006/customXml" ds:itemID="{FA8D0DA3-2176-4B14-B44C-282CC4FD514E}">
+  <ds:schemaRefs>
+    <ds:schemaRef ds:uri="urn:microsoft-dynamics-businesscentral/internal/extended/reports/Bicycle_Rental_Report/50400/"/>
+  </ds:schemaRefs>
+</ds:datastoreItem>
+</file>
+
+<file path=customXml/itemProps2.xml><?xml version="1.0" encoding="utf-8"?>
 <ds:datastoreItem xmlns:ds="http://schemas.openxmlformats.org/officeDocument/2006/customXml" ds:itemID="{773EEAEE-57CF-46CA-BEB5-CD936B803A2D}">
   <ds:schemaRefs>
     <ds:schemaRef ds:uri="urn:microsoft-dynamics-nav/reports/Bicycle_Rental_Report/50400/"/>
   </ds:schemaRefs>
 </ds:datastoreItem>
-</file>
-
-<file path=customXml/itemProps2.xml><?xml version="1.0" encoding="utf-8"?>
-<ds:datastoreItem xmlns:ds="http://schemas.openxmlformats.org/officeDocument/2006/customXml" ds:itemID="{FA8D0DA3-2176-4B14-B44C-282CC4FD514E}">
-  <ds:schemaRefs>
-    <ds:schemaRef ds:uri="urn:microsoft-dynamics-businesscentral/internal/extended/reports/Bicycle_Rental_Report/50400/"/>
-  </ds:schemaRefs>
-</ds:datastoreItem>
 </file>
</xml_diff>

<commit_message>
TASK 3 KONČAN (Potrebno še urediti izgled report potem + DODATNBE TOČKE)
</commit_message>
<xml_diff>
--- a/Bicycle-Rental-Report.docx
+++ b/Bicycle-Rental-Report.docx
@@ -2,173 +2,75 @@
 <file path=word/document.xml><?xml version="1.0" encoding="utf-8"?>
 <w:document xmlns:wpc="http://schemas.microsoft.com/office/word/2010/wordprocessingCanvas" xmlns:cx="http://schemas.microsoft.com/office/drawing/2014/chartex" xmlns:cx1="http://schemas.microsoft.com/office/drawing/2015/9/8/chartex" xmlns:cx2="http://schemas.microsoft.com/office/drawing/2015/10/21/chartex" xmlns:cx3="http://schemas.microsoft.com/office/drawing/2016/5/9/chartex" xmlns:cx4="http://schemas.microsoft.com/office/drawing/2016/5/10/chartex" xmlns:cx5="http://schemas.microsoft.com/office/drawing/2016/5/11/chartex" xmlns:cx6="http://schemas.microsoft.com/office/drawing/2016/5/12/chartex" xmlns:cx7="http://schemas.microsoft.com/office/drawing/2016/5/13/chartex" xmlns:cx8="http://schemas.microsoft.com/office/drawing/2016/5/14/chartex" xmlns:mc="http://schemas.openxmlformats.org/markup-compatibility/2006" xmlns:aink="http://schemas.microsoft.com/office/drawing/2016/ink" xmlns:am3d="http://schemas.microsoft.com/office/drawing/2017/model3d" xmlns:o="urn:schemas-microsoft-com:office:office" xmlns:oel="http://schemas.microsoft.com/office/2019/extlst" xmlns:r="http://schemas.openxmlformats.org/officeDocument/2006/relationships" xmlns:m="http://schemas.openxmlformats.org/officeDocument/2006/math" xmlns:v="urn:schemas-microsoft-com:vml" xmlns:wp14="http://schemas.microsoft.com/office/word/2010/wordprocessingDrawing" xmlns:wp="http://schemas.openxmlformats.org/drawingml/2006/wordprocessingDrawing" xmlns:w10="urn:schemas-microsoft-com:office:word" xmlns:w="http://schemas.openxmlformats.org/wordprocessingml/2006/main" xmlns:w14="http://schemas.microsoft.com/office/word/2010/wordml" xmlns:w15="http://schemas.microsoft.com/office/word/2012/wordml" xmlns:w16cex="http://schemas.microsoft.com/office/word/2018/wordml/cex" xmlns:w16cid="http://schemas.microsoft.com/office/word/2016/wordml/cid" xmlns:w16="http://schemas.microsoft.com/office/word/2018/wordml" xmlns:w16sdtdh="http://schemas.microsoft.com/office/word/2020/wordml/sdtdatahash" xmlns:w16se="http://schemas.microsoft.com/office/word/2015/wordml/symex" xmlns:wpg="http://schemas.microsoft.com/office/word/2010/wordprocessingGroup" xmlns:wpi="http://schemas.microsoft.com/office/word/2010/wordprocessingInk" xmlns:wne="http://schemas.microsoft.com/office/word/2006/wordml" xmlns:wps="http://schemas.microsoft.com/office/word/2010/wordprocessingShape" mc:Ignorable="w14 w15 w16se w16cid w16 w16cex w16sdtdh wp14">
   <w:body>
-    <w:p>
+    <w:p/>
+    <w:tbl>
+      <w:tblPr>
+        <w:tblStyle w:val="Tabelamrea"/>
+        <w:tblW w:w="0" w:type="auto"/>
+        <w:tblLook w:val="04A0" w:firstRow="1" w:lastRow="0" w:firstColumn="1" w:lastColumn="0" w:noHBand="0" w:noVBand="1"/>
+      </w:tblPr>
+      <w:tblGrid>
+        <w:gridCol w:w="9628"/>
+      </w:tblGrid>
       <w:sdt>
         <w:sdtPr>
-          <w:alias w:val="#Nav: /BCReportInformation/ReportRequest/CompanyName"/>
+          <w:alias w:val="#Nav: /Customer"/>
           <w:tag w:val="#Nav: Bicycle_Rental_Report/50400"/>
-          <w:id w:val="1868713791"/>
-          <w:placeholder>
-            <w:docPart w:val="DefaultPlaceholder_-1854013440"/>
-          </w:placeholder>
-          <w:dataBinding w:prefixMappings="xmlns:ns0='urn:microsoft-dynamics-nav/reports/Bicycle_Rental_Report/50400/' " w:xpath="/ns0:NavWordReportXmlPart[1]/ns0:BCReportInformation[1]/ns0:ReportRequest[1]/ns0:CompanyName[1]" w:storeItemID="{773EEAEE-57CF-46CA-BEB5-CD936B803A2D}"/>
-          <w:text/>
+          <w:id w:val="-1234314340"/>
+          <w15:dataBinding w:prefixMappings="xmlns:ns0='urn:microsoft-dynamics-nav/reports/Bicycle_Rental_Report/50400/' " w:xpath="/ns0:NavWordReportXmlPart[1]/ns0:Customer" w:storeItemID="{C11D49A8-DB31-44A7-A755-5CA23EDD3BF7}"/>
+          <w15:repeatingSection/>
         </w:sdtPr>
         <w:sdtContent>
-          <w:proofErr w:type="spellStart"/>
-          <w:r>
-            <w:t>Company</w:t>
-          </w:r>
-          <w:proofErr w:type="spellEnd"/>
-          <w:r>
-            <w:t xml:space="preserve"> Name</w:t>
-          </w:r>
-        </w:sdtContent>
-      </w:sdt>
-      <w:r>
-        <w:t xml:space="preserve">, </w:t>
-      </w:r>
-      <w:sdt>
-        <w:sdtPr>
-          <w:alias w:val="#Nav: /Customer/CurrentDate_"/>
-          <w:tag w:val="#Nav: Bicycle_Rental_Report/50400"/>
-          <w:id w:val="-77827943"/>
-          <w:placeholder>
-            <w:docPart w:val="DefaultPlaceholder_-1854013440"/>
-          </w:placeholder>
-          <w:dataBinding w:prefixMappings="xmlns:ns0='urn:microsoft-dynamics-nav/reports/Bicycle_Rental_Report/50400/' " w:xpath="/ns0:NavWordReportXmlPart[1]/ns0:Customer[1]/ns0:CurrentDate_[1]" w:storeItemID="{773EEAEE-57CF-46CA-BEB5-CD936B803A2D}"/>
-          <w:text/>
-        </w:sdtPr>
-        <w:sdtContent>
-          <w:proofErr w:type="spellStart"/>
-          <w:r>
-            <w:t>CurrentDate</w:t>
-          </w:r>
-          <w:proofErr w:type="spellEnd"/>
-          <w:r>
-            <w:t>_</w:t>
-          </w:r>
-        </w:sdtContent>
-      </w:sdt>
-    </w:p>
-    <w:p>
-      <w:pPr>
-        <w:jc w:val="center"/>
-        <w:rPr>
-          <w:sz w:val="36"/>
-          <w:szCs w:val="36"/>
-        </w:rPr>
-      </w:pPr>
-      <w:sdt>
-        <w:sdtPr>
-          <w:rPr>
-            <w:sz w:val="36"/>
-            <w:szCs w:val="36"/>
-          </w:rPr>
-          <w:alias w:val="#Nav: /Labels/ReportTitle"/>
-          <w:tag w:val="#Nav: Bicycle_Rental_Report/50400"/>
-          <w:id w:val="-1161465534"/>
-          <w:placeholder>
-            <w:docPart w:val="DefaultPlaceholder_-1854013440"/>
-          </w:placeholder>
-          <w:dataBinding w:prefixMappings="xmlns:ns0='urn:microsoft-dynamics-nav/reports/Bicycle_Rental_Report/50400/' " w:xpath="/ns0:NavWordReportXmlPart[1]/ns0:Labels[1]/ns0:ReportTitle[1]" w:storeItemID="{773EEAEE-57CF-46CA-BEB5-CD936B803A2D}"/>
-          <w:text/>
-        </w:sdtPr>
-        <w:sdtContent>
-          <w:proofErr w:type="spellStart"/>
-          <w:r>
-            <w:rPr>
-              <w:sz w:val="36"/>
-              <w:szCs w:val="36"/>
-            </w:rPr>
-            <w:t>ReportTitle</w:t>
-          </w:r>
-          <w:proofErr w:type="spellEnd"/>
-        </w:sdtContent>
-      </w:sdt>
-      <w:r>
-        <w:rPr>
-          <w:sz w:val="36"/>
-          <w:szCs w:val="36"/>
-        </w:rPr>
-        <w:t xml:space="preserve"> : #</w:t>
-      </w:r>
-      <w:sdt>
-        <w:sdtPr>
-          <w:rPr>
-            <w:sz w:val="36"/>
-            <w:szCs w:val="36"/>
-          </w:rPr>
-          <w:alias w:val="#Nav: /Customer/Rental_Header/No_"/>
-          <w:tag w:val="#Nav: Bicycle_Rental_Report/50400"/>
-          <w:id w:val="1219169725"/>
-          <w:placeholder>
-            <w:docPart w:val="DefaultPlaceholder_-1854013440"/>
-          </w:placeholder>
-          <w:dataBinding w:prefixMappings="xmlns:ns0='urn:microsoft-dynamics-nav/reports/Bicycle_Rental_Report/50400/' " w:xpath="/ns0:NavWordReportXmlPart[1]/ns0:Customer[1]/ns0:Rental_Header[1]/ns0:No_[1]" w:storeItemID="{773EEAEE-57CF-46CA-BEB5-CD936B803A2D}"/>
-          <w:text/>
-        </w:sdtPr>
-        <w:sdtContent>
-          <w:r>
-            <w:rPr>
-              <w:sz w:val="36"/>
-              <w:szCs w:val="36"/>
-            </w:rPr>
-            <w:t>No_</w:t>
-          </w:r>
-        </w:sdtContent>
-      </w:sdt>
-    </w:p>
-    <w:p>
-      <w:pPr>
-        <w:jc w:val="center"/>
-      </w:pPr>
-    </w:p>
-    <w:p>
-      <w:pPr>
-        <w:jc w:val="center"/>
-      </w:pPr>
-    </w:p>
-    <w:sdt>
-      <w:sdtPr>
-        <w:id w:val="-520394645"/>
-        <w15:dataBinding w:prefixMappings="xmlns:ns0='urn:microsoft-dynamics-nav/reports/Bicycle_Rental_Report/50400/' " w:xpath="/ns0:NavWordReportXmlPart[1]/ns0:Customer" w:storeItemID="{773EEAEE-57CF-46CA-BEB5-CD936B803A2D}"/>
-        <w15:repeatingSection/>
-        <w:alias w:val="#Nav: /Customer"/>
-        <w:tag w:val="#Nav: Bicycle_Rental_Report/50400"/>
-      </w:sdtPr>
-      <w:sdtContent>
-        <w:sdt>
-          <w:sdtPr>
-            <w:id w:val="-1932352544"/>
-            <w:placeholder>
-              <w:docPart w:val="DefaultPlaceholder_-1854013435"/>
-            </w:placeholder>
-            <w15:repeatingSectionItem/>
-          </w:sdtPr>
-          <w:sdtContent>
-            <w:tbl>
-              <w:tblPr>
-                <w:tblStyle w:val="Tabelamrea"/>
-                <w:tblW w:w="9658" w:type="dxa"/>
-                <w:tblLayout w:type="fixed"/>
-                <w:tblLook w:val="04A0" w:firstRow="1" w:lastRow="0" w:firstColumn="1" w:lastColumn="0" w:noHBand="0" w:noVBand="1"/>
-              </w:tblPr>
-              <w:tblGrid>
-                <w:gridCol w:w="988"/>
-                <w:gridCol w:w="1701"/>
-                <w:gridCol w:w="2126"/>
-                <w:gridCol w:w="1559"/>
-                <w:gridCol w:w="1701"/>
-                <w:gridCol w:w="709"/>
-                <w:gridCol w:w="874"/>
-              </w:tblGrid>
+          <w:sdt>
+            <w:sdtPr>
+              <w:id w:val="2110469856"/>
+              <w:placeholder>
+                <w:docPart w:val="DefaultPlaceholder_-1854013435"/>
+              </w:placeholder>
+              <w15:repeatingSectionItem/>
+            </w:sdtPr>
+            <w:sdtContent>
               <w:tr>
                 <w:tc>
                   <w:tcPr>
-                    <w:tcW w:w="9658" w:type="dxa"/>
-                    <w:gridSpan w:val="7"/>
+                    <w:tcW w:w="9628" w:type="dxa"/>
                   </w:tcPr>
+                  <w:p/>
+                  <w:sdt>
+                    <w:sdtPr>
+                      <w:alias w:val="#Nav: /Customer/CurrentDate_"/>
+                      <w:tag w:val="#Nav: Bicycle_Rental_Report/50400"/>
+                      <w:id w:val="1903101524"/>
+                      <w:placeholder>
+                        <w:docPart w:val="DefaultPlaceholder_-1854013440"/>
+                      </w:placeholder>
+                      <w:dataBinding w:prefixMappings="xmlns:ns0='urn:microsoft-dynamics-nav/reports/Bicycle_Rental_Report/50400/' " w:xpath="/ns0:NavWordReportXmlPart[1]/ns0:Customer[1]/ns0:CurrentDate_[1]" w:storeItemID="{C11D49A8-DB31-44A7-A755-5CA23EDD3BF7}"/>
+                      <w:text/>
+                    </w:sdtPr>
+                    <w:sdtContent>
+                      <w:p>
+                        <w:proofErr w:type="spellStart"/>
+                        <w:r>
+                          <w:t>CurrentDate</w:t>
+                        </w:r>
+                        <w:proofErr w:type="spellEnd"/>
+                        <w:r>
+                          <w:t>_</w:t>
+                        </w:r>
+                      </w:p>
+                    </w:sdtContent>
+                  </w:sdt>
+                  <w:p>
+                    <w:pPr>
+                      <w:jc w:val="center"/>
+                    </w:pPr>
+                    <w:r>
+                      <w:t>Izposoja Koles</w:t>
+                    </w:r>
+                  </w:p>
+                  <w:p/>
+                  <w:p/>
+                  <w:p/>
                   <w:p>
                     <w:proofErr w:type="spellStart"/>
                     <w:r>
@@ -176,41 +78,21 @@
                     </w:r>
                     <w:proofErr w:type="spellEnd"/>
                     <w:r>
-                      <w:t xml:space="preserve">: </w:t>
-                    </w:r>
-                    <w:sdt>
-                      <w:sdtPr>
-                        <w:alias w:val="#Nav: /Customer/CustomerName"/>
-                        <w:tag w:val="#Nav: Bicycle_Rental_Report/50400"/>
-                        <w:id w:val="764578476"/>
-                        <w:placeholder>
-                          <w:docPart w:val="DefaultPlaceholder_-1854013440"/>
-                        </w:placeholder>
-                        <w:dataBinding w:prefixMappings="xmlns:ns0='urn:microsoft-dynamics-nav/reports/Bicycle_Rental_Report/50400/' " w:xpath="/ns0:NavWordReportXmlPart[1]/ns0:Customer[1]/ns0:CustomerName[1]" w:storeItemID="{773EEAEE-57CF-46CA-BEB5-CD936B803A2D}"/>
-                        <w:text/>
-                      </w:sdtPr>
-                      <w:sdtContent>
-                        <w:proofErr w:type="spellStart"/>
-                        <w:r>
-                          <w:t>CustomerName</w:t>
-                        </w:r>
-                      </w:sdtContent>
-                    </w:sdt>
-                    <w:r>
-                      <w:t>,</w:t>
+                      <w:t xml:space="preserve"> No = </w:t>
                     </w:r>
                     <w:sdt>
                       <w:sdtPr>
                         <w:alias w:val="#Nav: /Customer/CustomerNo_"/>
                         <w:tag w:val="#Nav: Bicycle_Rental_Report/50400"/>
-                        <w:id w:val="-1062249058"/>
+                        <w:id w:val="1184400005"/>
                         <w:placeholder>
                           <w:docPart w:val="DefaultPlaceholder_-1854013440"/>
                         </w:placeholder>
-                        <w:dataBinding w:prefixMappings="xmlns:ns0='urn:microsoft-dynamics-nav/reports/Bicycle_Rental_Report/50400/' " w:xpath="/ns0:NavWordReportXmlPart[1]/ns0:Customer[1]/ns0:CustomerNo_[1]" w:storeItemID="{773EEAEE-57CF-46CA-BEB5-CD936B803A2D}"/>
+                        <w:dataBinding w:prefixMappings="xmlns:ns0='urn:microsoft-dynamics-nav/reports/Bicycle_Rental_Report/50400/' " w:xpath="/ns0:NavWordReportXmlPart[1]/ns0:Customer[1]/ns0:CustomerNo_[1]" w:storeItemID="{C11D49A8-DB31-44A7-A755-5CA23EDD3BF7}"/>
                         <w:text/>
                       </w:sdtPr>
                       <w:sdtContent>
+                        <w:proofErr w:type="spellStart"/>
                         <w:r>
                           <w:t>CustomerNo</w:t>
                         </w:r>
@@ -221,461 +103,503 @@
                       </w:sdtContent>
                     </w:sdt>
                   </w:p>
+                  <w:p>
+                    <w:proofErr w:type="spellStart"/>
+                    <w:r>
+                      <w:t>Customer</w:t>
+                    </w:r>
+                    <w:proofErr w:type="spellEnd"/>
+                    <w:r>
+                      <w:t xml:space="preserve"> Name = </w:t>
+                    </w:r>
+                    <w:sdt>
+                      <w:sdtPr>
+                        <w:alias w:val="#Nav: /Customer/CustomerName"/>
+                        <w:tag w:val="#Nav: Bicycle_Rental_Report/50400"/>
+                        <w:id w:val="220727199"/>
+                        <w:placeholder>
+                          <w:docPart w:val="DefaultPlaceholder_-1854013440"/>
+                        </w:placeholder>
+                        <w:dataBinding w:prefixMappings="xmlns:ns0='urn:microsoft-dynamics-nav/reports/Bicycle_Rental_Report/50400/' " w:xpath="/ns0:NavWordReportXmlPart[1]/ns0:Customer[1]/ns0:CustomerName[1]" w:storeItemID="{C11D49A8-DB31-44A7-A755-5CA23EDD3BF7}"/>
+                        <w:text/>
+                      </w:sdtPr>
+                      <w:sdtContent>
+                        <w:proofErr w:type="spellStart"/>
+                        <w:r>
+                          <w:t>CustomerName</w:t>
+                        </w:r>
+                        <w:proofErr w:type="spellEnd"/>
+                      </w:sdtContent>
+                    </w:sdt>
+                  </w:p>
+                  <w:p/>
+                  <w:p/>
+                  <w:tbl>
+                    <w:tblPr>
+                      <w:tblStyle w:val="Tabelamrea"/>
+                      <w:tblW w:w="0" w:type="auto"/>
+                      <w:tblLook w:val="04A0" w:firstRow="1" w:lastRow="0" w:firstColumn="1" w:lastColumn="0" w:noHBand="0" w:noVBand="1"/>
+                    </w:tblPr>
+                    <w:tblGrid>
+                      <w:gridCol w:w="9402"/>
+                    </w:tblGrid>
+                    <w:sdt>
+                      <w:sdtPr>
+                        <w:alias w:val="#Nav: /Customer/Rental_Header"/>
+                        <w:tag w:val="#Nav: Bicycle_Rental_Report/50400"/>
+                        <w:id w:val="-958024752"/>
+                        <w15:dataBinding w:prefixMappings="xmlns:ns0='urn:microsoft-dynamics-nav/reports/Bicycle_Rental_Report/50400/' " w:xpath="/ns0:NavWordReportXmlPart[1]/ns0:Customer[1]/ns0:Rental_Header" w:storeItemID="{C11D49A8-DB31-44A7-A755-5CA23EDD3BF7}"/>
+                        <w15:repeatingSection/>
+                      </w:sdtPr>
+                      <w:sdtContent>
+                        <w:sdt>
+                          <w:sdtPr>
+                            <w:id w:val="1762180640"/>
+                            <w:placeholder>
+                              <w:docPart w:val="DefaultPlaceholder_-1854013435"/>
+                            </w:placeholder>
+                            <w15:repeatingSectionItem/>
+                          </w:sdtPr>
+                          <w:sdtContent>
+                            <w:tr>
+                              <w:tc>
+                                <w:tcPr>
+                                  <w:tcW w:w="9402" w:type="dxa"/>
+                                  <w:tcBorders>
+                                    <w:top w:val="nil"/>
+                                    <w:left w:val="nil"/>
+                                    <w:bottom w:val="nil"/>
+                                    <w:right w:val="nil"/>
+                                  </w:tcBorders>
+                                </w:tcPr>
+                                <w:p>
+                                  <w:r>
+                                    <w:t xml:space="preserve">No = </w:t>
+                                  </w:r>
+                                  <w:sdt>
+                                    <w:sdtPr>
+                                      <w:alias w:val="#Nav: /Customer/Rental_Header/No_"/>
+                                      <w:tag w:val="#Nav: Bicycle_Rental_Report/50400"/>
+                                      <w:id w:val="-1371913329"/>
+                                      <w:placeholder>
+                                        <w:docPart w:val="DefaultPlaceholder_-1854013440"/>
+                                      </w:placeholder>
+                                      <w:dataBinding w:prefixMappings="xmlns:ns0='urn:microsoft-dynamics-nav/reports/Bicycle_Rental_Report/50400/' " w:xpath="/ns0:NavWordReportXmlPart[1]/ns0:Customer[1]/ns0:Rental_Header[1]/ns0:No_[1]" w:storeItemID="{C11D49A8-DB31-44A7-A755-5CA23EDD3BF7}"/>
+                                      <w:text/>
+                                    </w:sdtPr>
+                                    <w:sdtContent>
+                                      <w:r>
+                                        <w:t>No_</w:t>
+                                      </w:r>
+                                    </w:sdtContent>
+                                  </w:sdt>
+                                </w:p>
+                                <w:p>
+                                  <w:proofErr w:type="spellStart"/>
+                                  <w:r>
+                                    <w:t>Rental</w:t>
+                                  </w:r>
+                                  <w:proofErr w:type="spellEnd"/>
+                                  <w:r>
+                                    <w:t xml:space="preserve"> Date = </w:t>
+                                  </w:r>
+                                  <w:sdt>
+                                    <w:sdtPr>
+                                      <w:alias w:val="#Nav: /Customer/Rental_Header/Rental_Date"/>
+                                      <w:tag w:val="#Nav: Bicycle_Rental_Report/50400"/>
+                                      <w:id w:val="496387417"/>
+                                      <w:placeholder>
+                                        <w:docPart w:val="DefaultPlaceholder_-1854013440"/>
+                                      </w:placeholder>
+                                      <w:dataBinding w:prefixMappings="xmlns:ns0='urn:microsoft-dynamics-nav/reports/Bicycle_Rental_Report/50400/' " w:xpath="/ns0:NavWordReportXmlPart[1]/ns0:Customer[1]/ns0:Rental_Header[1]/ns0:Rental_Date[1]" w:storeItemID="{C11D49A8-DB31-44A7-A755-5CA23EDD3BF7}"/>
+                                      <w:text/>
+                                    </w:sdtPr>
+                                    <w:sdtContent>
+                                      <w:proofErr w:type="spellStart"/>
+                                      <w:r>
+                                        <w:t>Rental_Date</w:t>
+                                      </w:r>
+                                      <w:proofErr w:type="spellEnd"/>
+                                    </w:sdtContent>
+                                  </w:sdt>
+                                </w:p>
+                                <w:p>
+                                  <w:proofErr w:type="spellStart"/>
+                                  <w:r>
+                                    <w:t>Expected</w:t>
+                                  </w:r>
+                                  <w:proofErr w:type="spellEnd"/>
+                                  <w:r>
+                                    <w:t xml:space="preserve"> </w:t>
+                                  </w:r>
+                                  <w:proofErr w:type="spellStart"/>
+                                  <w:r>
+                                    <w:t>Rental</w:t>
+                                  </w:r>
+                                  <w:proofErr w:type="spellEnd"/>
+                                  <w:r>
+                                    <w:t xml:space="preserve"> Date = </w:t>
+                                  </w:r>
+                                  <w:sdt>
+                                    <w:sdtPr>
+                                      <w:alias w:val="#Nav: /Customer/Rental_Header/Expected_Return_Date"/>
+                                      <w:tag w:val="#Nav: Bicycle_Rental_Report/50400"/>
+                                      <w:id w:val="1658184616"/>
+                                      <w:placeholder>
+                                        <w:docPart w:val="DefaultPlaceholder_-1854013440"/>
+                                      </w:placeholder>
+                                      <w:dataBinding w:prefixMappings="xmlns:ns0='urn:microsoft-dynamics-nav/reports/Bicycle_Rental_Report/50400/' " w:xpath="/ns0:NavWordReportXmlPart[1]/ns0:Customer[1]/ns0:Rental_Header[1]/ns0:Expected_Return_Date[1]" w:storeItemID="{C11D49A8-DB31-44A7-A755-5CA23EDD3BF7}"/>
+                                      <w:text/>
+                                    </w:sdtPr>
+                                    <w:sdtContent>
+                                      <w:proofErr w:type="spellStart"/>
+                                      <w:r>
+                                        <w:t>Expected_Return_Date</w:t>
+                                      </w:r>
+                                      <w:proofErr w:type="spellEnd"/>
+                                    </w:sdtContent>
+                                  </w:sdt>
+                                </w:p>
+                                <w:p>
+                                  <w:proofErr w:type="spellStart"/>
+                                  <w:r>
+                                    <w:t>Actual</w:t>
+                                  </w:r>
+                                  <w:proofErr w:type="spellEnd"/>
+                                  <w:r>
+                                    <w:t xml:space="preserve"> </w:t>
+                                  </w:r>
+                                  <w:proofErr w:type="spellStart"/>
+                                  <w:r>
+                                    <w:t>Rental</w:t>
+                                  </w:r>
+                                  <w:proofErr w:type="spellEnd"/>
+                                  <w:r>
+                                    <w:t xml:space="preserve"> Date = </w:t>
+                                  </w:r>
+                                  <w:sdt>
+                                    <w:sdtPr>
+                                      <w:alias w:val="#Nav: /Customer/Rental_Header/Actual_Return_Date"/>
+                                      <w:tag w:val="#Nav: Bicycle_Rental_Report/50400"/>
+                                      <w:id w:val="-1354108079"/>
+                                      <w:placeholder>
+                                        <w:docPart w:val="DefaultPlaceholder_-1854013440"/>
+                                      </w:placeholder>
+                                      <w:dataBinding w:prefixMappings="xmlns:ns0='urn:microsoft-dynamics-nav/reports/Bicycle_Rental_Report/50400/' " w:xpath="/ns0:NavWordReportXmlPart[1]/ns0:Customer[1]/ns0:Rental_Header[1]/ns0:Actual_Return_Date[1]" w:storeItemID="{C11D49A8-DB31-44A7-A755-5CA23EDD3BF7}"/>
+                                      <w:text/>
+                                    </w:sdtPr>
+                                    <w:sdtContent>
+                                      <w:proofErr w:type="spellStart"/>
+                                      <w:r>
+                                        <w:t>Actual_Return_Date</w:t>
+                                      </w:r>
+                                      <w:proofErr w:type="spellEnd"/>
+                                    </w:sdtContent>
+                                  </w:sdt>
+                                </w:p>
+                                <w:p>
+                                  <w:r>
+                                    <w:t xml:space="preserve">Status = </w:t>
+                                  </w:r>
+                                  <w:sdt>
+                                    <w:sdtPr>
+                                      <w:alias w:val="#Nav: /Customer/Rental_Header/Status"/>
+                                      <w:tag w:val="#Nav: Bicycle_Rental_Report/50400"/>
+                                      <w:id w:val="-935527506"/>
+                                      <w:placeholder>
+                                        <w:docPart w:val="DefaultPlaceholder_-1854013440"/>
+                                      </w:placeholder>
+                                      <w:dataBinding w:prefixMappings="xmlns:ns0='urn:microsoft-dynamics-nav/reports/Bicycle_Rental_Report/50400/' " w:xpath="/ns0:NavWordReportXmlPart[1]/ns0:Customer[1]/ns0:Rental_Header[1]/ns0:Status[1]" w:storeItemID="{C11D49A8-DB31-44A7-A755-5CA23EDD3BF7}"/>
+                                      <w:text/>
+                                    </w:sdtPr>
+                                    <w:sdtContent>
+                                      <w:r>
+                                        <w:t>Status</w:t>
+                                      </w:r>
+                                    </w:sdtContent>
+                                  </w:sdt>
+                                </w:p>
+                                <w:p/>
+                                <w:tbl>
+                                  <w:tblPr>
+                                    <w:tblStyle w:val="Tabelamrea"/>
+                                    <w:tblW w:w="0" w:type="auto"/>
+                                    <w:tblLook w:val="04A0" w:firstRow="1" w:lastRow="0" w:firstColumn="1" w:lastColumn="0" w:noHBand="0" w:noVBand="1"/>
+                                  </w:tblPr>
+                                  <w:tblGrid>
+                                    <w:gridCol w:w="1835"/>
+                                    <w:gridCol w:w="1835"/>
+                                    <w:gridCol w:w="1835"/>
+                                    <w:gridCol w:w="1835"/>
+                                    <w:gridCol w:w="1836"/>
+                                  </w:tblGrid>
+                                  <w:tr>
+                                    <w:tc>
+                                      <w:tcPr>
+                                        <w:tcW w:w="1835" w:type="dxa"/>
+                                      </w:tcPr>
+                                      <w:p>
+                                        <w:proofErr w:type="spellStart"/>
+                                        <w:r>
+                                          <w:t>Bicycle</w:t>
+                                        </w:r>
+                                        <w:proofErr w:type="spellEnd"/>
+                                        <w:r>
+                                          <w:t xml:space="preserve"> No</w:t>
+                                        </w:r>
+                                      </w:p>
+                                    </w:tc>
+                                    <w:tc>
+                                      <w:tcPr>
+                                        <w:tcW w:w="1835" w:type="dxa"/>
+                                      </w:tcPr>
+                                      <w:p>
+                                        <w:proofErr w:type="spellStart"/>
+                                        <w:r>
+                                          <w:t>Description</w:t>
+                                        </w:r>
+                                        <w:proofErr w:type="spellEnd"/>
+                                      </w:p>
+                                    </w:tc>
+                                    <w:tc>
+                                      <w:tcPr>
+                                        <w:tcW w:w="1835" w:type="dxa"/>
+                                      </w:tcPr>
+                                      <w:p>
+                                        <w:proofErr w:type="spellStart"/>
+                                        <w:r>
+                                          <w:t>Daily</w:t>
+                                        </w:r>
+                                        <w:proofErr w:type="spellEnd"/>
+                                        <w:r>
+                                          <w:t xml:space="preserve"> </w:t>
+                                        </w:r>
+                                        <w:proofErr w:type="spellStart"/>
+                                        <w:r>
+                                          <w:t>Rate</w:t>
+                                        </w:r>
+                                        <w:proofErr w:type="spellEnd"/>
+                                      </w:p>
+                                    </w:tc>
+                                    <w:tc>
+                                      <w:tcPr>
+                                        <w:tcW w:w="1835" w:type="dxa"/>
+                                      </w:tcPr>
+                                      <w:p>
+                                        <w:proofErr w:type="spellStart"/>
+                                        <w:r>
+                                          <w:t>Rental</w:t>
+                                        </w:r>
+                                        <w:proofErr w:type="spellEnd"/>
+                                        <w:r>
+                                          <w:t xml:space="preserve"> </w:t>
+                                        </w:r>
+                                        <w:proofErr w:type="spellStart"/>
+                                        <w:r>
+                                          <w:t>Days</w:t>
+                                        </w:r>
+                                        <w:proofErr w:type="spellEnd"/>
+                                      </w:p>
+                                    </w:tc>
+                                    <w:tc>
+                                      <w:tcPr>
+                                        <w:tcW w:w="1836" w:type="dxa"/>
+                                      </w:tcPr>
+                                      <w:p>
+                                        <w:r>
+                                          <w:t xml:space="preserve">Line </w:t>
+                                        </w:r>
+                                        <w:proofErr w:type="spellStart"/>
+                                        <w:r>
+                                          <w:t>Amount</w:t>
+                                        </w:r>
+                                        <w:proofErr w:type="spellEnd"/>
+                                      </w:p>
+                                    </w:tc>
+                                  </w:tr>
+                                  <w:sdt>
+                                    <w:sdtPr>
+                                      <w:alias w:val="#Nav: /Customer/Rental_Header/Rental_Line"/>
+                                      <w:tag w:val="#Nav: Bicycle_Rental_Report/50400"/>
+                                      <w:id w:val="2061351906"/>
+                                      <w15:dataBinding w:prefixMappings="xmlns:ns0='urn:microsoft-dynamics-nav/reports/Bicycle_Rental_Report/50400/' " w:xpath="/ns0:NavWordReportXmlPart[1]/ns0:Customer[1]/ns0:Rental_Header[1]/ns0:Rental_Line" w:storeItemID="{C11D49A8-DB31-44A7-A755-5CA23EDD3BF7}"/>
+                                      <w15:repeatingSection/>
+                                    </w:sdtPr>
+                                    <w:sdtContent>
+                                      <w:sdt>
+                                        <w:sdtPr>
+                                          <w:id w:val="2001230450"/>
+                                          <w:placeholder>
+                                            <w:docPart w:val="DefaultPlaceholder_-1854013435"/>
+                                          </w:placeholder>
+                                          <w15:repeatingSectionItem/>
+                                        </w:sdtPr>
+                                        <w:sdtContent>
+                                          <w:tr>
+                                            <w:sdt>
+                                              <w:sdtPr>
+                                                <w:alias w:val="#Nav: /Customer/Rental_Header/Rental_Line/Bicycle_No_"/>
+                                                <w:tag w:val="#Nav: Bicycle_Rental_Report/50400"/>
+                                                <w:id w:val="-29340980"/>
+                                                <w:placeholder>
+                                                  <w:docPart w:val="DefaultPlaceholder_-1854013440"/>
+                                                </w:placeholder>
+                                                <w:dataBinding w:prefixMappings="xmlns:ns0='urn:microsoft-dynamics-nav/reports/Bicycle_Rental_Report/50400/' " w:xpath="/ns0:NavWordReportXmlPart[1]/ns0:Customer[1]/ns0:Rental_Header[1]/ns0:Rental_Line[1]/ns0:Bicycle_No_[1]" w:storeItemID="{C11D49A8-DB31-44A7-A755-5CA23EDD3BF7}"/>
+                                                <w:text/>
+                                              </w:sdtPr>
+                                              <w:sdtContent>
+                                                <w:tc>
+                                                  <w:tcPr>
+                                                    <w:tcW w:w="1835" w:type="dxa"/>
+                                                  </w:tcPr>
+                                                  <w:p>
+                                                    <w:proofErr w:type="spellStart"/>
+                                                    <w:r>
+                                                      <w:t>Bicycle_No</w:t>
+                                                    </w:r>
+                                                    <w:proofErr w:type="spellEnd"/>
+                                                    <w:r>
+                                                      <w:t>_</w:t>
+                                                    </w:r>
+                                                  </w:p>
+                                                </w:tc>
+                                              </w:sdtContent>
+                                            </w:sdt>
+                                            <w:sdt>
+                                              <w:sdtPr>
+                                                <w:alias w:val="#Nav: /Customer/Rental_Header/Rental_Line/Description"/>
+                                                <w:tag w:val="#Nav: Bicycle_Rental_Report/50400"/>
+                                                <w:id w:val="-869376910"/>
+                                                <w:placeholder>
+                                                  <w:docPart w:val="DefaultPlaceholder_-1854013440"/>
+                                                </w:placeholder>
+                                                <w:dataBinding w:prefixMappings="xmlns:ns0='urn:microsoft-dynamics-nav/reports/Bicycle_Rental_Report/50400/' " w:xpath="/ns0:NavWordReportXmlPart[1]/ns0:Customer[1]/ns0:Rental_Header[1]/ns0:Rental_Line[1]/ns0:Description[1]" w:storeItemID="{C11D49A8-DB31-44A7-A755-5CA23EDD3BF7}"/>
+                                                <w:text/>
+                                              </w:sdtPr>
+                                              <w:sdtContent>
+                                                <w:tc>
+                                                  <w:tcPr>
+                                                    <w:tcW w:w="1835" w:type="dxa"/>
+                                                  </w:tcPr>
+                                                  <w:p>
+                                                    <w:proofErr w:type="spellStart"/>
+                                                    <w:r>
+                                                      <w:t>Description</w:t>
+                                                    </w:r>
+                                                    <w:proofErr w:type="spellEnd"/>
+                                                  </w:p>
+                                                </w:tc>
+                                              </w:sdtContent>
+                                            </w:sdt>
+                                            <w:sdt>
+                                              <w:sdtPr>
+                                                <w:alias w:val="#Nav: /Customer/Rental_Header/Rental_Line/Daily_Rate"/>
+                                                <w:tag w:val="#Nav: Bicycle_Rental_Report/50400"/>
+                                                <w:id w:val="1265419771"/>
+                                                <w:placeholder>
+                                                  <w:docPart w:val="DefaultPlaceholder_-1854013440"/>
+                                                </w:placeholder>
+                                                <w:dataBinding w:prefixMappings="xmlns:ns0='urn:microsoft-dynamics-nav/reports/Bicycle_Rental_Report/50400/' " w:xpath="/ns0:NavWordReportXmlPart[1]/ns0:Customer[1]/ns0:Rental_Header[1]/ns0:Rental_Line[1]/ns0:Daily_Rate[1]" w:storeItemID="{C11D49A8-DB31-44A7-A755-5CA23EDD3BF7}"/>
+                                                <w:text/>
+                                              </w:sdtPr>
+                                              <w:sdtContent>
+                                                <w:tc>
+                                                  <w:tcPr>
+                                                    <w:tcW w:w="1835" w:type="dxa"/>
+                                                  </w:tcPr>
+                                                  <w:p>
+                                                    <w:proofErr w:type="spellStart"/>
+                                                    <w:r>
+                                                      <w:t>Daily_Rate</w:t>
+                                                    </w:r>
+                                                    <w:proofErr w:type="spellEnd"/>
+                                                  </w:p>
+                                                </w:tc>
+                                              </w:sdtContent>
+                                            </w:sdt>
+                                            <w:sdt>
+                                              <w:sdtPr>
+                                                <w:alias w:val="#Nav: /Customer/Rental_Header/Rental_Line/Rental_Days"/>
+                                                <w:tag w:val="#Nav: Bicycle_Rental_Report/50400"/>
+                                                <w:id w:val="-1374311183"/>
+                                                <w:placeholder>
+                                                  <w:docPart w:val="DefaultPlaceholder_-1854013440"/>
+                                                </w:placeholder>
+                                                <w:dataBinding w:prefixMappings="xmlns:ns0='urn:microsoft-dynamics-nav/reports/Bicycle_Rental_Report/50400/' " w:xpath="/ns0:NavWordReportXmlPart[1]/ns0:Customer[1]/ns0:Rental_Header[1]/ns0:Rental_Line[1]/ns0:Rental_Days[1]" w:storeItemID="{C11D49A8-DB31-44A7-A755-5CA23EDD3BF7}"/>
+                                                <w:text/>
+                                              </w:sdtPr>
+                                              <w:sdtContent>
+                                                <w:tc>
+                                                  <w:tcPr>
+                                                    <w:tcW w:w="1835" w:type="dxa"/>
+                                                  </w:tcPr>
+                                                  <w:p>
+                                                    <w:proofErr w:type="spellStart"/>
+                                                    <w:r>
+                                                      <w:t>Rental_Days</w:t>
+                                                    </w:r>
+                                                    <w:proofErr w:type="spellEnd"/>
+                                                  </w:p>
+                                                </w:tc>
+                                              </w:sdtContent>
+                                            </w:sdt>
+                                            <w:sdt>
+                                              <w:sdtPr>
+                                                <w:alias w:val="#Nav: /Customer/Rental_Header/Rental_Line/Line_Amount"/>
+                                                <w:tag w:val="#Nav: Bicycle_Rental_Report/50400"/>
+                                                <w:id w:val="-50004689"/>
+                                                <w:placeholder>
+                                                  <w:docPart w:val="DefaultPlaceholder_-1854013440"/>
+                                                </w:placeholder>
+                                                <w:dataBinding w:prefixMappings="xmlns:ns0='urn:microsoft-dynamics-nav/reports/Bicycle_Rental_Report/50400/' " w:xpath="/ns0:NavWordReportXmlPart[1]/ns0:Customer[1]/ns0:Rental_Header[1]/ns0:Rental_Line[1]/ns0:Line_Amount[1]" w:storeItemID="{C11D49A8-DB31-44A7-A755-5CA23EDD3BF7}"/>
+                                                <w:text/>
+                                              </w:sdtPr>
+                                              <w:sdtContent>
+                                                <w:tc>
+                                                  <w:tcPr>
+                                                    <w:tcW w:w="1836" w:type="dxa"/>
+                                                  </w:tcPr>
+                                                  <w:p>
+                                                    <w:proofErr w:type="spellStart"/>
+                                                    <w:r>
+                                                      <w:t>Line_Amount</w:t>
+                                                    </w:r>
+                                                    <w:proofErr w:type="spellEnd"/>
+                                                  </w:p>
+                                                </w:tc>
+                                              </w:sdtContent>
+                                            </w:sdt>
+                                          </w:tr>
+                                        </w:sdtContent>
+                                      </w:sdt>
+                                    </w:sdtContent>
+                                  </w:sdt>
+                                </w:tbl>
+                                <w:p/>
+                              </w:tc>
+                            </w:tr>
+                          </w:sdtContent>
+                        </w:sdt>
+                      </w:sdtContent>
+                    </w:sdt>
+                  </w:tbl>
+                  <w:p/>
                 </w:tc>
               </w:tr>
-              <w:tr>
-                <w:sdt>
-                  <w:sdtPr>
-                    <w:alias w:val="#Nav: /Labels/No_Caption"/>
-                    <w:tag w:val="#Nav: Bicycle_Rental_Report/50400"/>
-                    <w:id w:val="-750117088"/>
-                    <w:placeholder>
-                      <w:docPart w:val="DefaultPlaceholder_-1854013440"/>
-                    </w:placeholder>
-                    <w:dataBinding w:prefixMappings="xmlns:ns0='urn:microsoft-dynamics-nav/reports/Bicycle_Rental_Report/50400/' " w:xpath="/ns0:NavWordReportXmlPart[1]/ns0:Labels[1]/ns0:No_Caption[1]" w:storeItemID="{773EEAEE-57CF-46CA-BEB5-CD936B803A2D}"/>
-                    <w:text/>
-                  </w:sdtPr>
-                  <w:sdtContent>
-                    <w:tc>
-                      <w:tcPr>
-                        <w:tcW w:w="988" w:type="dxa"/>
-                      </w:tcPr>
-                      <w:p>
-                        <w:pPr>
-                          <w:jc w:val="center"/>
-                        </w:pPr>
-                        <w:proofErr w:type="spellStart"/>
-                        <w:r>
-                          <w:t>No_Caption</w:t>
-                        </w:r>
-                        <w:proofErr w:type="spellEnd"/>
-                      </w:p>
-                    </w:tc>
-                  </w:sdtContent>
-                </w:sdt>
-                <w:sdt>
-                  <w:sdtPr>
-                    <w:alias w:val="#Nav: /Labels/Rental_DateCaption"/>
-                    <w:tag w:val="#Nav: Bicycle_Rental_Report/50400"/>
-                    <w:id w:val="-397058469"/>
-                    <w:placeholder>
-                      <w:docPart w:val="DefaultPlaceholder_-1854013440"/>
-                    </w:placeholder>
-                    <w:dataBinding w:prefixMappings="xmlns:ns0='urn:microsoft-dynamics-nav/reports/Bicycle_Rental_Report/50400/' " w:xpath="/ns0:NavWordReportXmlPart[1]/ns0:Labels[1]/ns0:Rental_DateCaption[1]" w:storeItemID="{773EEAEE-57CF-46CA-BEB5-CD936B803A2D}"/>
-                    <w:text/>
-                  </w:sdtPr>
-                  <w:sdtContent>
-                    <w:tc>
-                      <w:tcPr>
-                        <w:tcW w:w="1701" w:type="dxa"/>
-                      </w:tcPr>
-                      <w:p>
-                        <w:pPr>
-                          <w:jc w:val="center"/>
-                        </w:pPr>
-                        <w:proofErr w:type="spellStart"/>
-                        <w:r>
-                          <w:t>Rental_DateCaption</w:t>
-                        </w:r>
-                        <w:proofErr w:type="spellEnd"/>
-                      </w:p>
-                    </w:tc>
-                  </w:sdtContent>
-                </w:sdt>
-                <w:sdt>
-                  <w:sdtPr>
-                    <w:alias w:val="#Nav: /Labels/Bicycle_No_Caption"/>
-                    <w:tag w:val="#Nav: Bicycle_Rental_Report/50400"/>
-                    <w:id w:val="867953051"/>
-                    <w:placeholder>
-                      <w:docPart w:val="DefaultPlaceholder_-1854013440"/>
-                    </w:placeholder>
-                    <w:dataBinding w:prefixMappings="xmlns:ns0='urn:microsoft-dynamics-nav/reports/Bicycle_Rental_Report/50400/' " w:xpath="/ns0:NavWordReportXmlPart[1]/ns0:Labels[1]/ns0:Bicycle_No_Caption[1]" w:storeItemID="{773EEAEE-57CF-46CA-BEB5-CD936B803A2D}"/>
-                    <w:text/>
-                  </w:sdtPr>
-                  <w:sdtContent>
-                    <w:tc>
-                      <w:tcPr>
-                        <w:tcW w:w="2126" w:type="dxa"/>
-                      </w:tcPr>
-                      <w:p>
-                        <w:pPr>
-                          <w:jc w:val="center"/>
-                        </w:pPr>
-                        <w:proofErr w:type="spellStart"/>
-                        <w:r>
-                          <w:t>Bicycle_No_Caption</w:t>
-                        </w:r>
-                        <w:proofErr w:type="spellEnd"/>
-                      </w:p>
-                    </w:tc>
-                  </w:sdtContent>
-                </w:sdt>
-                <w:sdt>
-                  <w:sdtPr>
-                    <w:alias w:val="#Nav: /Labels/DescriptionCaption"/>
-                    <w:tag w:val="#Nav: Bicycle_Rental_Report/50400"/>
-                    <w:id w:val="280924568"/>
-                    <w:placeholder>
-                      <w:docPart w:val="DefaultPlaceholder_-1854013440"/>
-                    </w:placeholder>
-                    <w:dataBinding w:prefixMappings="xmlns:ns0='urn:microsoft-dynamics-nav/reports/Bicycle_Rental_Report/50400/' " w:xpath="/ns0:NavWordReportXmlPart[1]/ns0:Labels[1]/ns0:DescriptionCaption[1]" w:storeItemID="{773EEAEE-57CF-46CA-BEB5-CD936B803A2D}"/>
-                    <w:text/>
-                  </w:sdtPr>
-                  <w:sdtContent>
-                    <w:tc>
-                      <w:tcPr>
-                        <w:tcW w:w="1559" w:type="dxa"/>
-                      </w:tcPr>
-                      <w:p>
-                        <w:pPr>
-                          <w:jc w:val="center"/>
-                        </w:pPr>
-                        <w:proofErr w:type="spellStart"/>
-                        <w:r>
-                          <w:t>DescriptionCaption</w:t>
-                        </w:r>
-                        <w:proofErr w:type="spellEnd"/>
-                      </w:p>
-                    </w:tc>
-                  </w:sdtContent>
-                </w:sdt>
-                <w:sdt>
-                  <w:sdtPr>
-                    <w:alias w:val="#Nav: /Labels/Rental_DaysCaption"/>
-                    <w:tag w:val="#Nav: Bicycle_Rental_Report/50400"/>
-                    <w:id w:val="884998558"/>
-                    <w:placeholder>
-                      <w:docPart w:val="DefaultPlaceholder_-1854013440"/>
-                    </w:placeholder>
-                    <w:dataBinding w:prefixMappings="xmlns:ns0='urn:microsoft-dynamics-nav/reports/Bicycle_Rental_Report/50400/' " w:xpath="/ns0:NavWordReportXmlPart[1]/ns0:Labels[1]/ns0:Rental_DaysCaption[1]" w:storeItemID="{773EEAEE-57CF-46CA-BEB5-CD936B803A2D}"/>
-                    <w:text/>
-                  </w:sdtPr>
-                  <w:sdtContent>
-                    <w:tc>
-                      <w:tcPr>
-                        <w:tcW w:w="1701" w:type="dxa"/>
-                      </w:tcPr>
-                      <w:p>
-                        <w:pPr>
-                          <w:jc w:val="center"/>
-                        </w:pPr>
-                        <w:proofErr w:type="spellStart"/>
-                        <w:r>
-                          <w:t>Rental_DaysCaption</w:t>
-                        </w:r>
-                        <w:proofErr w:type="spellEnd"/>
-                      </w:p>
-                    </w:tc>
-                  </w:sdtContent>
-                </w:sdt>
-                <w:sdt>
-                  <w:sdtPr>
-                    <w:alias w:val="#Nav: /Labels/Daily_RateCaption"/>
-                    <w:tag w:val="#Nav: Bicycle_Rental_Report/50400"/>
-                    <w:id w:val="-360129310"/>
-                    <w:placeholder>
-                      <w:docPart w:val="DefaultPlaceholder_-1854013440"/>
-                    </w:placeholder>
-                    <w:dataBinding w:prefixMappings="xmlns:ns0='urn:microsoft-dynamics-nav/reports/Bicycle_Rental_Report/50400/' " w:xpath="/ns0:NavWordReportXmlPart[1]/ns0:Labels[1]/ns0:Daily_RateCaption[1]" w:storeItemID="{773EEAEE-57CF-46CA-BEB5-CD936B803A2D}"/>
-                    <w:text/>
-                  </w:sdtPr>
-                  <w:sdtContent>
-                    <w:tc>
-                      <w:tcPr>
-                        <w:tcW w:w="709" w:type="dxa"/>
-                      </w:tcPr>
-                      <w:p>
-                        <w:pPr>
-                          <w:jc w:val="center"/>
-                        </w:pPr>
-                        <w:proofErr w:type="spellStart"/>
-                        <w:r>
-                          <w:t>Daily_RateCaption</w:t>
-                        </w:r>
-                        <w:proofErr w:type="spellEnd"/>
-                      </w:p>
-                    </w:tc>
-                  </w:sdtContent>
-                </w:sdt>
-                <w:sdt>
-                  <w:sdtPr>
-                    <w:alias w:val="#Nav: /Labels/Line_AmountCaption"/>
-                    <w:tag w:val="#Nav: Bicycle_Rental_Report/50400"/>
-                    <w:id w:val="-642809030"/>
-                    <w:placeholder>
-                      <w:docPart w:val="DefaultPlaceholder_-1854013440"/>
-                    </w:placeholder>
-                    <w:dataBinding w:prefixMappings="xmlns:ns0='urn:microsoft-dynamics-nav/reports/Bicycle_Rental_Report/50400/' " w:xpath="/ns0:NavWordReportXmlPart[1]/ns0:Labels[1]/ns0:Line_AmountCaption[1]" w:storeItemID="{773EEAEE-57CF-46CA-BEB5-CD936B803A2D}"/>
-                    <w:text/>
-                  </w:sdtPr>
-                  <w:sdtContent>
-                    <w:tc>
-                      <w:tcPr>
-                        <w:tcW w:w="874" w:type="dxa"/>
-                      </w:tcPr>
-                      <w:p>
-                        <w:pPr>
-                          <w:jc w:val="center"/>
-                        </w:pPr>
-                        <w:proofErr w:type="spellStart"/>
-                        <w:r>
-                          <w:t>Line_AmountCaption</w:t>
-                        </w:r>
-                        <w:proofErr w:type="spellEnd"/>
-                      </w:p>
-                    </w:tc>
-                  </w:sdtContent>
-                </w:sdt>
-              </w:tr>
-              <w:sdt>
-                <w:sdtPr>
-                  <w:alias w:val="#Nav: /Customer/Rental_Header"/>
-                  <w:tag w:val="#Nav: Bicycle_Rental_Report/50400"/>
-                  <w:id w:val="1676619169"/>
-                  <w15:dataBinding w:prefixMappings="xmlns:ns0='urn:microsoft-dynamics-nav/reports/Bicycle_Rental_Report/50400/' " w:xpath="/ns0:NavWordReportXmlPart[1]/ns0:Customer[1]/ns0:Rental_Header" w:storeItemID="{773EEAEE-57CF-46CA-BEB5-CD936B803A2D}"/>
-                  <w15:repeatingSection/>
-                </w:sdtPr>
-                <w:sdtContent>
-                  <w:sdt>
-                    <w:sdtPr>
-                      <w:id w:val="-386110614"/>
-                      <w:placeholder>
-                        <w:docPart w:val="DefaultPlaceholder_-1854013435"/>
-                      </w:placeholder>
-                      <w15:repeatingSectionItem/>
-                    </w:sdtPr>
-                    <w:sdtContent>
-                      <w:tr>
-                        <w:sdt>
-                          <w:sdtPr>
-                            <w:alias w:val="#Nav: /Customer/Rental_Header/No_"/>
-                            <w:tag w:val="#Nav: Bicycle_Rental_Report/50400"/>
-                            <w:id w:val="588350103"/>
-                            <w:placeholder>
-                              <w:docPart w:val="DefaultPlaceholder_-1854013440"/>
-                            </w:placeholder>
-                            <w:dataBinding w:prefixMappings="xmlns:ns0='urn:microsoft-dynamics-nav/reports/Bicycle_Rental_Report/50400/' " w:xpath="/ns0:NavWordReportXmlPart[1]/ns0:Customer[1]/ns0:Rental_Header[1]/ns0:No_[1]" w:storeItemID="{773EEAEE-57CF-46CA-BEB5-CD936B803A2D}"/>
-                            <w:text/>
-                          </w:sdtPr>
-                          <w:sdtContent>
-                            <w:tc>
-                              <w:tcPr>
-                                <w:tcW w:w="988" w:type="dxa"/>
-                              </w:tcPr>
-                              <w:p>
-                                <w:pPr>
-                                  <w:jc w:val="center"/>
-                                </w:pPr>
-                                <w:r>
-                                  <w:t>No_</w:t>
-                                </w:r>
-                              </w:p>
-                            </w:tc>
-                          </w:sdtContent>
-                        </w:sdt>
-                        <w:sdt>
-                          <w:sdtPr>
-                            <w:alias w:val="#Nav: /Customer/Rental_Header/Rental_Date"/>
-                            <w:tag w:val="#Nav: Bicycle_Rental_Report/50400"/>
-                            <w:id w:val="1570774585"/>
-                            <w:placeholder>
-                              <w:docPart w:val="DefaultPlaceholder_-1854013440"/>
-                            </w:placeholder>
-                            <w:dataBinding w:prefixMappings="xmlns:ns0='urn:microsoft-dynamics-nav/reports/Bicycle_Rental_Report/50400/' " w:xpath="/ns0:NavWordReportXmlPart[1]/ns0:Customer[1]/ns0:Rental_Header[1]/ns0:Rental_Date[1]" w:storeItemID="{773EEAEE-57CF-46CA-BEB5-CD936B803A2D}"/>
-                            <w:text/>
-                          </w:sdtPr>
-                          <w:sdtContent>
-                            <w:tc>
-                              <w:tcPr>
-                                <w:tcW w:w="1701" w:type="dxa"/>
-                              </w:tcPr>
-                              <w:p>
-                                <w:pPr>
-                                  <w:jc w:val="center"/>
-                                </w:pPr>
-                                <w:proofErr w:type="spellStart"/>
-                                <w:r>
-                                  <w:t>Rental_Date</w:t>
-                                </w:r>
-                                <w:proofErr w:type="spellEnd"/>
-                              </w:p>
-                            </w:tc>
-                          </w:sdtContent>
-                        </w:sdt>
-                        <w:sdt>
-                          <w:sdtPr>
-                            <w:alias w:val="#Nav: /Customer/Rental_Header/Rental_Line/Bicycle_No_"/>
-                            <w:tag w:val="#Nav: Bicycle_Rental_Report/50400"/>
-                            <w:id w:val="1023128761"/>
-                            <w:placeholder>
-                              <w:docPart w:val="DefaultPlaceholder_-1854013440"/>
-                            </w:placeholder>
-                            <w:dataBinding w:prefixMappings="xmlns:ns0='urn:microsoft-dynamics-nav/reports/Bicycle_Rental_Report/50400/' " w:xpath="/ns0:NavWordReportXmlPart[1]/ns0:Customer[1]/ns0:Rental_Header[1]/ns0:Rental_Line[1]/ns0:Bicycle_No_[1]" w:storeItemID="{773EEAEE-57CF-46CA-BEB5-CD936B803A2D}"/>
-                            <w:text/>
-                          </w:sdtPr>
-                          <w:sdtContent>
-                            <w:tc>
-                              <w:tcPr>
-                                <w:tcW w:w="2126" w:type="dxa"/>
-                              </w:tcPr>
-                              <w:p>
-                                <w:pPr>
-                                  <w:jc w:val="center"/>
-                                </w:pPr>
-                                <w:proofErr w:type="spellStart"/>
-                                <w:r>
-                                  <w:t>Bicycle_No</w:t>
-                                </w:r>
-                                <w:proofErr w:type="spellEnd"/>
-                                <w:r>
-                                  <w:t>_</w:t>
-                                </w:r>
-                              </w:p>
-                            </w:tc>
-                          </w:sdtContent>
-                        </w:sdt>
-                        <w:sdt>
-                          <w:sdtPr>
-                            <w:alias w:val="#Nav: /Customer/Rental_Header/Rental_Line/Description"/>
-                            <w:tag w:val="#Nav: Bicycle_Rental_Report/50400"/>
-                            <w:id w:val="-494273641"/>
-                            <w:placeholder>
-                              <w:docPart w:val="DefaultPlaceholder_-1854013440"/>
-                            </w:placeholder>
-                            <w:dataBinding w:prefixMappings="xmlns:ns0='urn:microsoft-dynamics-nav/reports/Bicycle_Rental_Report/50400/' " w:xpath="/ns0:NavWordReportXmlPart[1]/ns0:Customer[1]/ns0:Rental_Header[1]/ns0:Rental_Line[1]/ns0:Description[1]" w:storeItemID="{773EEAEE-57CF-46CA-BEB5-CD936B803A2D}"/>
-                            <w:text/>
-                          </w:sdtPr>
-                          <w:sdtContent>
-                            <w:tc>
-                              <w:tcPr>
-                                <w:tcW w:w="1559" w:type="dxa"/>
-                              </w:tcPr>
-                              <w:p>
-                                <w:pPr>
-                                  <w:jc w:val="center"/>
-                                </w:pPr>
-                                <w:proofErr w:type="spellStart"/>
-                                <w:r>
-                                  <w:t>Description</w:t>
-                                </w:r>
-                                <w:proofErr w:type="spellEnd"/>
-                              </w:p>
-                            </w:tc>
-                          </w:sdtContent>
-                        </w:sdt>
-                        <w:sdt>
-                          <w:sdtPr>
-                            <w:alias w:val="#Nav: /Customer/Rental_Header/Rental_Line/Rental_Days"/>
-                            <w:tag w:val="#Nav: Bicycle_Rental_Report/50400"/>
-                            <w:id w:val="-21866291"/>
-                            <w:placeholder>
-                              <w:docPart w:val="DefaultPlaceholder_-1854013440"/>
-                            </w:placeholder>
-                            <w:dataBinding w:prefixMappings="xmlns:ns0='urn:microsoft-dynamics-nav/reports/Bicycle_Rental_Report/50400/' " w:xpath="/ns0:NavWordReportXmlPart[1]/ns0:Customer[1]/ns0:Rental_Header[1]/ns0:Rental_Line[1]/ns0:Rental_Days[1]" w:storeItemID="{773EEAEE-57CF-46CA-BEB5-CD936B803A2D}"/>
-                            <w:text/>
-                          </w:sdtPr>
-                          <w:sdtContent>
-                            <w:tc>
-                              <w:tcPr>
-                                <w:tcW w:w="1701" w:type="dxa"/>
-                              </w:tcPr>
-                              <w:p>
-                                <w:pPr>
-                                  <w:jc w:val="center"/>
-                                </w:pPr>
-                                <w:proofErr w:type="spellStart"/>
-                                <w:r>
-                                  <w:t>Rental_Days</w:t>
-                                </w:r>
-                                <w:proofErr w:type="spellEnd"/>
-                              </w:p>
-                            </w:tc>
-                          </w:sdtContent>
-                        </w:sdt>
-                        <w:sdt>
-                          <w:sdtPr>
-                            <w:alias w:val="#Nav: /Customer/Rental_Header/Rental_Line/Daily_Rate"/>
-                            <w:tag w:val="#Nav: Bicycle_Rental_Report/50400"/>
-                            <w:id w:val="-1720119634"/>
-                            <w:placeholder>
-                              <w:docPart w:val="DefaultPlaceholder_-1854013440"/>
-                            </w:placeholder>
-                            <w:dataBinding w:prefixMappings="xmlns:ns0='urn:microsoft-dynamics-nav/reports/Bicycle_Rental_Report/50400/' " w:xpath="/ns0:NavWordReportXmlPart[1]/ns0:Customer[1]/ns0:Rental_Header[1]/ns0:Rental_Line[1]/ns0:Daily_Rate[1]" w:storeItemID="{773EEAEE-57CF-46CA-BEB5-CD936B803A2D}"/>
-                            <w:text/>
-                          </w:sdtPr>
-                          <w:sdtContent>
-                            <w:tc>
-                              <w:tcPr>
-                                <w:tcW w:w="709" w:type="dxa"/>
-                              </w:tcPr>
-                              <w:p>
-                                <w:pPr>
-                                  <w:jc w:val="center"/>
-                                </w:pPr>
-                                <w:proofErr w:type="spellStart"/>
-                                <w:r>
-                                  <w:t>Daily_Rate</w:t>
-                                </w:r>
-                                <w:proofErr w:type="spellEnd"/>
-                              </w:p>
-                            </w:tc>
-                          </w:sdtContent>
-                        </w:sdt>
-                        <w:sdt>
-                          <w:sdtPr>
-                            <w:alias w:val="#Nav: /Customer/Rental_Header/Rental_Line/Line_Amount"/>
-                            <w:tag w:val="#Nav: Bicycle_Rental_Report/50400"/>
-                            <w:id w:val="-2084669519"/>
-                            <w:placeholder>
-                              <w:docPart w:val="DefaultPlaceholder_-1854013440"/>
-                            </w:placeholder>
-                            <w:dataBinding w:prefixMappings="xmlns:ns0='urn:microsoft-dynamics-nav/reports/Bicycle_Rental_Report/50400/' " w:xpath="/ns0:NavWordReportXmlPart[1]/ns0:Customer[1]/ns0:Rental_Header[1]/ns0:Rental_Line[1]/ns0:Line_Amount[1]" w:storeItemID="{773EEAEE-57CF-46CA-BEB5-CD936B803A2D}"/>
-                            <w:text/>
-                          </w:sdtPr>
-                          <w:sdtContent>
-                            <w:tc>
-                              <w:tcPr>
-                                <w:tcW w:w="874" w:type="dxa"/>
-                              </w:tcPr>
-                              <w:p>
-                                <w:pPr>
-                                  <w:jc w:val="center"/>
-                                </w:pPr>
-                                <w:proofErr w:type="spellStart"/>
-                                <w:r>
-                                  <w:t>Line_Amount</w:t>
-                                </w:r>
-                                <w:proofErr w:type="spellEnd"/>
-                              </w:p>
-                            </w:tc>
-                          </w:sdtContent>
-                        </w:sdt>
-                      </w:tr>
-                    </w:sdtContent>
-                  </w:sdt>
-                </w:sdtContent>
-              </w:sdt>
-            </w:tbl>
-          </w:sdtContent>
-        </w:sdt>
-      </w:sdtContent>
-    </w:sdt>
-    <w:p>
-      <w:pPr>
-        <w:jc w:val="center"/>
-      </w:pPr>
-    </w:p>
-    <w:p>
-      <w:pPr>
-        <w:jc w:val="center"/>
-      </w:pPr>
-    </w:p>
-    <w:p>
-      <w:pPr>
-        <w:jc w:val="center"/>
-      </w:pPr>
-    </w:p>
+            </w:sdtContent>
+          </w:sdt>
+        </w:sdtContent>
+      </w:sdt>
+      <w:tr>
+        <w:tc>
+          <w:tcPr>
+            <w:tcW w:w="9628" w:type="dxa"/>
+          </w:tcPr>
+          <w:p/>
+        </w:tc>
+      </w:tr>
+    </w:tbl>
+    <w:p/>
     <w:sectPr>
       <w:pgSz w:w="11906" w:h="16838"/>
       <w:pgMar w:top="1701" w:right="1134" w:bottom="1701" w:left="1134" w:header="708" w:footer="708" w:gutter="0"/>
@@ -1114,21 +1038,11 @@
     <w:semiHidden/>
     <w:unhideWhenUsed/>
   </w:style>
-  <w:style w:type="character" w:styleId="Besedilooznabemesta">
-    <w:name w:val="Placeholder Text"/>
-    <w:basedOn w:val="Privzetapisavaodstavka"/>
-    <w:uiPriority w:val="99"/>
-    <w:semiHidden/>
-    <w:rsid w:val="001F4C15"/>
-    <w:rPr>
-      <w:color w:val="666666"/>
-    </w:rPr>
-  </w:style>
   <w:style w:type="table" w:styleId="Tabelamrea">
     <w:name w:val="Table Grid"/>
     <w:basedOn w:val="Navadnatabela"/>
     <w:uiPriority w:val="39"/>
-    <w:rsid w:val="007F2C22"/>
+    <w:rsid w:val="00C432D4"/>
     <w:pPr>
       <w:spacing w:after="0" w:line="240" w:lineRule="auto"/>
     </w:pPr>
@@ -1143,12 +1057,48 @@
       </w:tblBorders>
     </w:tblPr>
   </w:style>
+  <w:style w:type="character" w:styleId="Besedilooznabemesta">
+    <w:name w:val="Placeholder Text"/>
+    <w:basedOn w:val="Privzetapisavaodstavka"/>
+    <w:uiPriority w:val="99"/>
+    <w:semiHidden/>
+    <w:rsid w:val="00C432D4"/>
+    <w:rPr>
+      <w:color w:val="666666"/>
+    </w:rPr>
+  </w:style>
 </w:styles>
 </file>
 
 <file path=word/glossary/document.xml><?xml version="1.0" encoding="utf-8"?>
 <w:glossaryDocument xmlns:wpc="http://schemas.microsoft.com/office/word/2010/wordprocessingCanvas" xmlns:cx="http://schemas.microsoft.com/office/drawing/2014/chartex" xmlns:cx1="http://schemas.microsoft.com/office/drawing/2015/9/8/chartex" xmlns:cx2="http://schemas.microsoft.com/office/drawing/2015/10/21/chartex" xmlns:cx3="http://schemas.microsoft.com/office/drawing/2016/5/9/chartex" xmlns:cx4="http://schemas.microsoft.com/office/drawing/2016/5/10/chartex" xmlns:cx5="http://schemas.microsoft.com/office/drawing/2016/5/11/chartex" xmlns:cx6="http://schemas.microsoft.com/office/drawing/2016/5/12/chartex" xmlns:cx7="http://schemas.microsoft.com/office/drawing/2016/5/13/chartex" xmlns:cx8="http://schemas.microsoft.com/office/drawing/2016/5/14/chartex" xmlns:mc="http://schemas.openxmlformats.org/markup-compatibility/2006" xmlns:aink="http://schemas.microsoft.com/office/drawing/2016/ink" xmlns:am3d="http://schemas.microsoft.com/office/drawing/2017/model3d" xmlns:o="urn:schemas-microsoft-com:office:office" xmlns:oel="http://schemas.microsoft.com/office/2019/extlst" xmlns:r="http://schemas.openxmlformats.org/officeDocument/2006/relationships" xmlns:m="http://schemas.openxmlformats.org/officeDocument/2006/math" xmlns:v="urn:schemas-microsoft-com:vml" xmlns:wp14="http://schemas.microsoft.com/office/word/2010/wordprocessingDrawing" xmlns:wp="http://schemas.openxmlformats.org/drawingml/2006/wordprocessingDrawing" xmlns:w10="urn:schemas-microsoft-com:office:word" xmlns:w="http://schemas.openxmlformats.org/wordprocessingml/2006/main" xmlns:w14="http://schemas.microsoft.com/office/word/2010/wordml" xmlns:w15="http://schemas.microsoft.com/office/word/2012/wordml" xmlns:w16cex="http://schemas.microsoft.com/office/word/2018/wordml/cex" xmlns:w16cid="http://schemas.microsoft.com/office/word/2016/wordml/cid" xmlns:w16="http://schemas.microsoft.com/office/word/2018/wordml" xmlns:w16sdtdh="http://schemas.microsoft.com/office/word/2020/wordml/sdtdatahash" xmlns:w16se="http://schemas.microsoft.com/office/word/2015/wordml/symex" xmlns:wpg="http://schemas.microsoft.com/office/word/2010/wordprocessingGroup" xmlns:wpi="http://schemas.microsoft.com/office/word/2010/wordprocessingInk" xmlns:wne="http://schemas.microsoft.com/office/word/2006/wordml" xmlns:wps="http://schemas.microsoft.com/office/word/2010/wordprocessingShape" mc:Ignorable="w14 w15 w16se w16cid w16 w16cex w16sdtdh wp14">
   <w:docParts>
+    <w:docPart>
+      <w:docPartPr>
+        <w:name w:val="DefaultPlaceholder_-1854013435"/>
+        <w:category>
+          <w:name w:val="Splošno"/>
+          <w:gallery w:val="placeholder"/>
+        </w:category>
+        <w:types>
+          <w:type w:val="bbPlcHdr"/>
+        </w:types>
+        <w:behaviors>
+          <w:behavior w:val="content"/>
+        </w:behaviors>
+        <w:guid w:val="{2D2C8359-05F7-4D02-A49D-7B1C738F9DB5}"/>
+      </w:docPartPr>
+      <w:docPartBody>
+        <w:p>
+          <w:r>
+            <w:rPr>
+              <w:rStyle w:val="Besedilooznabemesta"/>
+            </w:rPr>
+            <w:t>Vnesite poljubno vsebino, ki jo želite ponoviti, vključno z drugimi kontrolniki vsebine. Če želite ponoviti dele tabele, lahko ta kontrolnik vstavite tudi okoli vrstic tabele.</w:t>
+          </w:r>
+        </w:p>
+      </w:docPartBody>
+    </w:docPart>
     <w:docPart>
       <w:docPartPr>
         <w:name w:val="DefaultPlaceholder_-1854013440"/>
@@ -1162,7 +1112,7 @@
         <w:behaviors>
           <w:behavior w:val="content"/>
         </w:behaviors>
-        <w:guid w:val="{AF836700-A064-4B6A-8F1C-DC89F73FD833}"/>
+        <w:guid w:val="{D5D9E240-6089-44A3-801B-406BA627642C}"/>
       </w:docPartPr>
       <w:docPartBody>
         <w:p>
@@ -1171,32 +1121,6 @@
               <w:rStyle w:val="Besedilooznabemesta"/>
             </w:rPr>
             <w:t>Kliknite ali tapnite tukaj, če želite vnesti besedilo.</w:t>
-          </w:r>
-        </w:p>
-      </w:docPartBody>
-    </w:docPart>
-    <w:docPart>
-      <w:docPartPr>
-        <w:name w:val="DefaultPlaceholder_-1854013435"/>
-        <w:category>
-          <w:name w:val="Splošno"/>
-          <w:gallery w:val="placeholder"/>
-        </w:category>
-        <w:types>
-          <w:type w:val="bbPlcHdr"/>
-        </w:types>
-        <w:behaviors>
-          <w:behavior w:val="content"/>
-        </w:behaviors>
-        <w:guid w:val="{CF858AC1-B3DB-4AAC-81F6-17A506DB72A3}"/>
-      </w:docPartPr>
-      <w:docPartBody>
-        <w:p>
-          <w:r>
-            <w:rPr>
-              <w:rStyle w:val="Besedilooznabemesta"/>
-            </w:rPr>
-            <w:t>Vnesite poljubno vsebino, ki jo želite ponoviti, vključno z drugimi kontrolniki vsebine. Če želite ponoviti dele tabele, lahko ta kontrolnik vstavite tudi okoli vrstic tabele.</w:t>
           </w:r>
         </w:p>
       </w:docPartBody>
@@ -1245,22 +1169,23 @@
     <w:compatSetting w:name="useWord2013TrackBottomHyphenation" w:uri="http://schemas.microsoft.com/office/word" w:val="0"/>
   </w:compat>
   <w:rsids>
-    <w:rsidRoot w:val="0089159B"/>
-    <w:rsid w:val="0018512B"/>
-    <w:rsid w:val="00391F6D"/>
-    <w:rsid w:val="005E4C07"/>
-    <w:rsid w:val="0089159B"/>
-    <w:rsid w:val="00B34C41"/>
-    <w:rsid w:val="00B6286E"/>
-    <w:rsid w:val="00C56A49"/>
-    <w:rsid w:val="00C62CE8"/>
-    <w:rsid w:val="00CD5D12"/>
-    <w:rsid w:val="00D03AC9"/>
-    <w:rsid w:val="00E0501E"/>
-    <w:rsid w:val="00E81B84"/>
-    <w:rsid w:val="00EA21AC"/>
-    <w:rsid w:val="00F074CD"/>
-    <w:rsid w:val="00F24C45"/>
+    <w:rsidRoot w:val="00F720A0"/>
+    <w:rsid w:val="00036049"/>
+    <w:rsid w:val="00113941"/>
+    <w:rsid w:val="0025465D"/>
+    <w:rsid w:val="00363A42"/>
+    <w:rsid w:val="003935B7"/>
+    <w:rsid w:val="00722167"/>
+    <w:rsid w:val="0076240F"/>
+    <w:rsid w:val="00985CE6"/>
+    <w:rsid w:val="00A51E02"/>
+    <w:rsid w:val="00BA3E82"/>
+    <w:rsid w:val="00C55142"/>
+    <w:rsid w:val="00E51386"/>
+    <w:rsid w:val="00E93972"/>
+    <w:rsid w:val="00F13C5E"/>
+    <w:rsid w:val="00F720A0"/>
+    <w:rsid w:val="00FF0E2C"/>
   </w:rsids>
   <m:mathPr>
     <m:mathFont m:val="Cambria Math"/>
@@ -1716,7 +1641,7 @@
     <w:basedOn w:val="Privzetapisavaodstavka"/>
     <w:uiPriority w:val="99"/>
     <w:semiHidden/>
-    <w:rsid w:val="00E81B84"/>
+    <w:rsid w:val="00F720A0"/>
     <w:rPr>
       <w:color w:val="666666"/>
     </w:rPr>
@@ -2026,7 +1951,9 @@
 </a:theme>
 </file>
 
-<file path=customXml/item1.xml>��< ? x m l   v e r s i o n = " 1 . 0 "   e n c o d i n g = " u t f - 1 6 " ? > < N a v W o r d R e p o r t X m l P a r t   x m l n s = " u r n : m i c r o s o f t - d y n a m i c s - b u s i n e s s c e n t r a l / i n t e r n a l / e x t e n d e d / r e p o r t s / B i c y c l e _ R e n t a l _ R e p o r t / 5 0 4 0 0 / " > +<file path=customXml/item1.xml>��< ? x m l   v e r s i o n = " 1 . 0 "   e n c o d i n g = " u t f - 1 6 " ? > + 
+ < N a v W o r d R e p o r t X m l P a r t   x m l n s = " u r n : m i c r o s o f t - d y n a m i c s - n a v / r e p o r t s / B i c y c l e _ R e n t a l _ R e p o r t / 5 0 4 0 0 / " >   
      < B C R e p o r t I n f o r m a t i o n >   
@@ -2094,81 +2021,65 @@
  
      < L a b e l s >   
-         < A c t u a l _ R e t u r n _ D a t e C a p t i o n   E l e m e n t T y p e = " P a r a m e t e r "   E l e m e n t I d = " 1 0 1 0 7 6 2 7 6 5 "   D a t a T y p e = " S t r i n g " > A c t u a l _ R e t u r n _ D a t e C a p t i o n < / A c t u a l _ R e t u r n _ D a t e C a p t i o n > - 
-         < B i c y c l e _ N o _ C a p t i o n   E l e m e n t T y p e = " P a r a m e t e r "   E l e m e n t I d = " 1 3 0 1 0 8 3 7 8 5 "   D a t a T y p e = " S t r i n g " > B i c y c l e _ N o _ C a p t i o n < / B i c y c l e _ N o _ C a p t i o n > - 
-         < C u s t o m e r N a m e C a p t i o n   E l e m e n t T y p e = " P a r a m e t e r "   E l e m e n t I d = " 2 6 5 4 9 6 8 2 6 "   D a t a T y p e = " S t r i n g " > C u s t o m e r N a m e C a p t i o n < / C u s t o m e r N a m e C a p t i o n > - 
-         < C u s t o m e r N o _ C a p t i o n   E l e m e n t T y p e = " P a r a m e t e r "   E l e m e n t I d = " 8 9 5 0 3 9 8 5 "   D a t a T y p e = " S t r i n g " > C u s t o m e r N o _ C a p t i o n < / C u s t o m e r N o _ C a p t i o n > - 
-         < D a i l y _ R a t e C a p t i o n   E l e m e n t T y p e = " P a r a m e t e r "   E l e m e n t I d = " 7 4 3 0 3 2 7 1 9 "   D a t a T y p e = " S t r i n g " > D a i l y _ R a t e C a p t i o n < / D a i l y _ R a t e C a p t i o n > - 
-         < D e s c r i p t i o n C a p t i o n   E l e m e n t T y p e = " P a r a m e t e r "   E l e m e n t I d = " 1 3 1 4 3 5 1 3 0 7 "   D a t a T y p e = " S t r i n g " > D e s c r i p t i o n C a p t i o n < / D e s c r i p t i o n C a p t i o n > - 
-         < E x p e c t e d _ R e t u r n _ D a t e C a p t i o n   E l e m e n t T y p e = " P a r a m e t e r "   E l e m e n t I d = " 1 9 3 0 8 5 9 1 5 "   D a t a T y p e = " S t r i n g " > E x p e c t e d _ R e t u r n _ D a t e C a p t i o n < / E x p e c t e d _ R e t u r n _ D a t e C a p t i o n > - 
-         < L i n e _ A m o u n t C a p t i o n   E l e m e n t T y p e = " P a r a m e t e r "   E l e m e n t I d = " 1 6 1 7 1 7 1 8 0 0 "   D a t a T y p e = " S t r i n g " > L i n e _ A m o u n t C a p t i o n < / L i n e _ A m o u n t C a p t i o n > - 
-         < N o _ C a p t i o n   E l e m e n t T y p e = " P a r a m e t e r "   E l e m e n t I d = " 1 0 8 0 6 9 1 2 5 3 "   D a t a T y p e = " S t r i n g " > N o _ C a p t i o n < / N o _ C a p t i o n > - 
-         < R e n t a l _ D a t e C a p t i o n   E l e m e n t T y p e = " P a r a m e t e r "   E l e m e n t I d = " 1 5 0 8 5 7 0 5 0 2 "   D a t a T y p e = " S t r i n g " > R e n t a l _ D a t e C a p t i o n < / R e n t a l _ D a t e C a p t i o n > - 
-         < R e n t a l _ D a y s C a p t i o n   E l e m e n t T y p e = " P a r a m e t e r "   E l e m e n t I d = " 1 8 5 9 4 2 2 4 3 5 "   D a t a T y p e = " S t r i n g " > R e n t a l _ D a y s C a p t i o n < / R e n t a l _ D a y s C a p t i o n > - 
-         < R e p o r t T i t l e   E l e m e n t T y p e = " P a r a m e t e r "   E l e m e n t I d = " 1 4 7 9 0 2 5 3 9 "   D a t a T y p e = " S t r i n g " > R e p o r t T i t l e < / R e p o r t T i t l e > - 
-         < S t a t u s C a p t i o n   E l e m e n t T y p e = " P a r a m e t e r "   E l e m e n t I d = " 1 6 3 4 1 4 4 5 5 1 "   D a t a T y p e = " S t r i n g " > S t a t u s C a p t i o n < / S t a t u s C a p t i o n > +         < A c t u a l _ R e t u r n _ D a t e C a p t i o n > A c t u a l _ R e t u r n _ D a t e C a p t i o n < / A c t u a l _ R e t u r n _ D a t e C a p t i o n > + 
+         < B i c y c l e _ N o _ C a p t i o n > B i c y c l e _ N o _ C a p t i o n < / B i c y c l e _ N o _ C a p t i o n > + 
+         < C u s t o m e r N a m e C a p t i o n > C u s t o m e r N a m e C a p t i o n < / C u s t o m e r N a m e C a p t i o n > + 
+         < C u s t o m e r N o _ C a p t i o n > C u s t o m e r N o _ C a p t i o n < / C u s t o m e r N o _ C a p t i o n > + 
+         < D a i l y _ R a t e C a p t i o n > D a i l y _ R a t e C a p t i o n < / D a i l y _ R a t e C a p t i o n > + 
+         < D e s c r i p t i o n C a p t i o n > D e s c r i p t i o n C a p t i o n < / D e s c r i p t i o n C a p t i o n > + 
+         < E x p e c t e d _ R e t u r n _ D a t e C a p t i o n > E x p e c t e d _ R e t u r n _ D a t e C a p t i o n < / E x p e c t e d _ R e t u r n _ D a t e C a p t i o n > + 
+         < L i n e _ A m o u n t C a p t i o n > L i n e _ A m o u n t C a p t i o n < / L i n e _ A m o u n t C a p t i o n > + 
+         < N o _ C a p t i o n > N o _ C a p t i o n < / N o _ C a p t i o n > + 
+         < R e n t a l _ D a t e C a p t i o n > R e n t a l _ D a t e C a p t i o n < / R e n t a l _ D a t e C a p t i o n > + 
+         < R e n t a l _ D a y s C a p t i o n > R e n t a l _ D a y s C a p t i o n < / R e n t a l _ D a y s C a p t i o n > + 
+         < R e p o r t T i t l e > R e p o r t T i t l e < / R e p o r t T i t l e > + 
+         < S t a t u s C a p t i o n > S t a t u s C a p t i o n < / S t a t u s C a p t i o n >   
      < / L a b e l s >   
-     < T o o l t i p s > - 
-         < T o o l t i p   c o l u m n = " C u s t o m e r N o _ "   E l e m e n t I d = " 8 9 5 0 3 9 8 5 " > - 
-             < T o o l t i p T e x t   l a n g = " e n - U S " > S p e c i f i e s   t h e   n u m b e r   o f   t h e   c u s t o m e r .   T h e   f i e l d   i s   e i t h e r   f i l l e d   a u t o m a t i c a l l y   f r o m   a   d e f i n e d   n u m b e r   s e r i e s ,   o r   y o u   e n t e r   t h e   n u m b e r   m a n u a l l y   b e c a u s e   y o u   h a v e   e n a b l e d   m a n u a l   n u m b e r   e n t r y   i n   t h e   n u m b e r - s e r i e s   s e t u p . < / T o o l t i p T e x t > - 
-         < / T o o l t i p > - 
-         < T o o l t i p   c o l u m n = " C u s t o m e r N a m e "   E l e m e n t I d = " 2 6 5 4 9 6 8 2 6 " > - 
-             < T o o l t i p T e x t   l a n g = " e n - U S " > S p e c i f i e s   t h e   c u s t o m e r ' s   n a m e   t h a t   a p p e a r s   o n   a l l   r e l a t e d   d o c u m e n t s .   F o r   c o m p a n i e s ,   s p e c i f y   t h e   c o m p a n y ' s   n a m e   h e r e ,   a n d   t h e n   a d d   t h e   r e l e v a n t   p e o p l e   a s   c o n t a c t s   t h a t   y o u   l i n k   t o   t h i s   c u s t o m e r . < / T o o l t i p T e x t > - 
-         < / T o o l t i p > - 
-     < / T o o l t i p s > - 
-     < C u s t o m e r   E l e m e n t T y p e = " D a t a I t e m "   E l e m e n t I d = " 1 5 2 5 1 9 1 9 9 " > - 
-         < C u r r e n t D a t e _   E l e m e n t T y p e = " C o l u m n "   E l e m e n t I d = " 4 7 8 2 7 1 8 6 5 "   D a t a T y p e = " D a t e " > C u r r e n t D a t e _ < / C u r r e n t D a t e _ > - 
-         < C u s t o m e r N a m e   E l e m e n t T y p e = " C o l u m n "   E l e m e n t I d = " 2 6 5 4 9 6 8 2 6 "   D a t a T y p e = " T e x t " > C u s t o m e r N a m e < / C u s t o m e r N a m e > - 
-         < C u s t o m e r N o _   E l e m e n t T y p e = " C o l u m n "   E l e m e n t I d = " 8 9 5 0 3 9 8 5 "   D a t a T y p e = " C o d e " > C u s t o m e r N o _ < / C u s t o m e r N o _ > - 
-         < R e n t a l _ H e a d e r   E l e m e n t T y p e = " D a t a I t e m "   E l e m e n t I d = " 6 5 8 2 2 0 6 9 9 " > - 
-             < A c t u a l _ R e t u r n _ D a t e   E l e m e n t T y p e = " C o l u m n "   E l e m e n t I d = " 1 0 1 0 7 6 2 7 6 5 "   D a t a T y p e = " D a t e " > A c t u a l _ R e t u r n _ D a t e < / A c t u a l _ R e t u r n _ D a t e > - 
-             < E x p e c t e d _ R e t u r n _ D a t e   E l e m e n t T y p e = " C o l u m n "   E l e m e n t I d = " 1 9 3 0 8 5 9 1 5 "   D a t a T y p e = " D a t e " > E x p e c t e d _ R e t u r n _ D a t e < / E x p e c t e d _ R e t u r n _ D a t e > - 
-             < N o _   E l e m e n t T y p e = " C o l u m n "   E l e m e n t I d = " 1 0 8 0 6 9 1 2 5 3 "   D a t a T y p e = " I n t e g e r " > N o _ < / N o _ > - 
-             < R e n t a l _ D a t e   E l e m e n t T y p e = " C o l u m n "   E l e m e n t I d = " 1 5 0 8 5 7 0 5 0 2 "   D a t a T y p e = " D a t e " > R e n t a l _ D a t e < / R e n t a l _ D a t e > - 
-             < S t a t u s   E l e m e n t T y p e = " C o l u m n "   E l e m e n t I d = " 1 6 3 4 1 4 4 5 5 1 "   D a t a T y p e = " E n u m " > S t a t u s < / S t a t u s > - 
-             < R e n t a l _ L i n e   E l e m e n t T y p e = " D a t a I t e m "   E l e m e n t I d = " 7 2 9 8 0 6 3 8 8 " > - 
-                 < B i c y c l e _ N o _   E l e m e n t T y p e = " C o l u m n "   E l e m e n t I d = " 1 3 0 1 0 8 3 7 8 5 "   D a t a T y p e = " C o d e " > B i c y c l e _ N o _ < / B i c y c l e _ N o _ > - 
-                 < D a i l y _ R a t e   E l e m e n t T y p e = " C o l u m n "   E l e m e n t I d = " 7 4 3 0 3 2 7 1 9 "   D a t a T y p e = " D e c i m a l " > D a i l y _ R a t e < / D a i l y _ R a t e > - 
-                 < D e s c r i p t i o n   E l e m e n t T y p e = " C o l u m n "   E l e m e n t I d = " 1 3 1 4 3 5 1 3 0 7 "   D a t a T y p e = " T e x t " > D e s c r i p t i o n < / D e s c r i p t i o n > - 
-                 < L i n e _ A m o u n t   E l e m e n t T y p e = " C o l u m n "   E l e m e n t I d = " 1 6 1 7 1 7 1 8 0 0 "   D a t a T y p e = " D e c i m a l " > L i n e _ A m o u n t < / L i n e _ A m o u n t > - 
-                 < R e n t a l _ D a y s   E l e m e n t T y p e = " C o l u m n "   E l e m e n t I d = " 1 8 5 9 4 2 2 4 3 5 "   D a t a T y p e = " I n t e g e r " > R e n t a l _ D a y s < / R e n t a l _ D a y s > +     < C u s t o m e r > + 
+         < C u r r e n t D a t e _ > C u r r e n t D a t e _ < / C u r r e n t D a t e _ > + 
+         < C u s t o m e r N a m e > C u s t o m e r N a m e < / C u s t o m e r N a m e > + 
+         < C u s t o m e r N o _ > C u s t o m e r N o _ < / C u s t o m e r N o _ > + 
+         < R e n t a l _ H e a d e r > + 
+             < A c t u a l _ R e t u r n _ D a t e > A c t u a l _ R e t u r n _ D a t e < / A c t u a l _ R e t u r n _ D a t e > + 
+             < E x p e c t e d _ R e t u r n _ D a t e > E x p e c t e d _ R e t u r n _ D a t e < / E x p e c t e d _ R e t u r n _ D a t e > + 
+             < N o _ > N o _ < / N o _ > + 
+             < R e n t a l _ D a t e > R e n t a l _ D a t e < / R e n t a l _ D a t e > + 
+             < S t a t u s > S t a t u s < / S t a t u s > + 
+             < R e n t a l _ L i n e > + 
+                 < B i c y c l e _ N o _ > B i c y c l e _ N o _ < / B i c y c l e _ N o _ > + 
+                 < D a i l y _ R a t e > D a i l y _ R a t e < / D a i l y _ R a t e > + 
+                 < D e s c r i p t i o n > D e s c r i p t i o n < / D e s c r i p t i o n > + 
+                 < L i n e _ A m o u n t > L i n e _ A m o u n t < / L i n e _ A m o u n t > + 
+                 < R e n t a l _ D a y s > R e n t a l _ D a y s < / R e n t a l _ D a y s >   
              < / R e n t a l _ L i n e >   
@@ -2179,9 +2090,7 @@
  < / N a v W o r d R e p o r t X m l P a r t > 
 </file>
 
-<file path=customXml/item2.xml>��< ? x m l   v e r s i o n = " 1 . 0 "   e n c o d i n g = " u t f - 1 6 " ? > - 
- < N a v W o r d R e p o r t X m l P a r t   x m l n s = " u r n : m i c r o s o f t - d y n a m i c s - n a v / r e p o r t s / B i c y c l e _ R e n t a l _ R e p o r t / 5 0 4 0 0 / " > +<file path=customXml/item2.xml>��< ? x m l   v e r s i o n = " 1 . 0 "   e n c o d i n g = " u t f - 1 6 " ? > < N a v W o r d R e p o r t X m l P a r t   x m l n s = " u r n : m i c r o s o f t - d y n a m i c s - b u s i n e s s c e n t r a l / i n t e r n a l / e x t e n d e d / r e p o r t s / B i c y c l e _ R e n t a l _ R e p o r t / 5 0 4 0 0 / " >   
      < B C R e p o r t I n f o r m a t i o n >   
@@ -2249,65 +2158,81 @@
  
      < L a b e l s >   
-         < A c t u a l _ R e t u r n _ D a t e C a p t i o n > A c t u a l _ R e t u r n _ D a t e C a p t i o n < / A c t u a l _ R e t u r n _ D a t e C a p t i o n > - 
-         < B i c y c l e _ N o _ C a p t i o n > B i c y c l e _ N o _ C a p t i o n < / B i c y c l e _ N o _ C a p t i o n > - 
-         < C u s t o m e r N a m e C a p t i o n > C u s t o m e r N a m e C a p t i o n < / C u s t o m e r N a m e C a p t i o n > - 
-         < C u s t o m e r N o _ C a p t i o n > C u s t o m e r N o _ C a p t i o n < / C u s t o m e r N o _ C a p t i o n > - 
-         < D a i l y _ R a t e C a p t i o n > D a i l y _ R a t e C a p t i o n < / D a i l y _ R a t e C a p t i o n > - 
-         < D e s c r i p t i o n C a p t i o n > D e s c r i p t i o n C a p t i o n < / D e s c r i p t i o n C a p t i o n > - 
-         < E x p e c t e d _ R e t u r n _ D a t e C a p t i o n > E x p e c t e d _ R e t u r n _ D a t e C a p t i o n < / E x p e c t e d _ R e t u r n _ D a t e C a p t i o n > - 
-         < L i n e _ A m o u n t C a p t i o n > L i n e _ A m o u n t C a p t i o n < / L i n e _ A m o u n t C a p t i o n > - 
-         < N o _ C a p t i o n > N o _ C a p t i o n < / N o _ C a p t i o n > - 
-         < R e n t a l _ D a t e C a p t i o n > R e n t a l _ D a t e C a p t i o n < / R e n t a l _ D a t e C a p t i o n > - 
-         < R e n t a l _ D a y s C a p t i o n > R e n t a l _ D a y s C a p t i o n < / R e n t a l _ D a y s C a p t i o n > - 
-         < R e p o r t T i t l e > R e p o r t T i t l e < / R e p o r t T i t l e > - 
-         < S t a t u s C a p t i o n > S t a t u s C a p t i o n < / S t a t u s C a p t i o n > +         < A c t u a l _ R e t u r n _ D a t e C a p t i o n   E l e m e n t T y p e = " P a r a m e t e r "   E l e m e n t I d = " 1 0 1 0 7 6 2 7 6 5 "   D a t a T y p e = " S t r i n g " > A c t u a l _ R e t u r n _ D a t e C a p t i o n < / A c t u a l _ R e t u r n _ D a t e C a p t i o n > + 
+         < B i c y c l e _ N o _ C a p t i o n   E l e m e n t T y p e = " P a r a m e t e r "   E l e m e n t I d = " 1 3 0 1 0 8 3 7 8 5 "   D a t a T y p e = " S t r i n g " > B i c y c l e _ N o _ C a p t i o n < / B i c y c l e _ N o _ C a p t i o n > + 
+         < C u s t o m e r N a m e C a p t i o n   E l e m e n t T y p e = " P a r a m e t e r "   E l e m e n t I d = " 2 6 5 4 9 6 8 2 6 "   D a t a T y p e = " S t r i n g " > C u s t o m e r N a m e C a p t i o n < / C u s t o m e r N a m e C a p t i o n > + 
+         < C u s t o m e r N o _ C a p t i o n   E l e m e n t T y p e = " P a r a m e t e r "   E l e m e n t I d = " 8 9 5 0 3 9 8 5 "   D a t a T y p e = " S t r i n g " > C u s t o m e r N o _ C a p t i o n < / C u s t o m e r N o _ C a p t i o n > + 
+         < D a i l y _ R a t e C a p t i o n   E l e m e n t T y p e = " P a r a m e t e r "   E l e m e n t I d = " 7 4 3 0 3 2 7 1 9 "   D a t a T y p e = " S t r i n g " > D a i l y _ R a t e C a p t i o n < / D a i l y _ R a t e C a p t i o n > + 
+         < D e s c r i p t i o n C a p t i o n   E l e m e n t T y p e = " P a r a m e t e r "   E l e m e n t I d = " 1 3 1 4 3 5 1 3 0 7 "   D a t a T y p e = " S t r i n g " > D e s c r i p t i o n C a p t i o n < / D e s c r i p t i o n C a p t i o n > + 
+         < E x p e c t e d _ R e t u r n _ D a t e C a p t i o n   E l e m e n t T y p e = " P a r a m e t e r "   E l e m e n t I d = " 1 9 3 0 8 5 9 1 5 "   D a t a T y p e = " S t r i n g " > E x p e c t e d _ R e t u r n _ D a t e C a p t i o n < / E x p e c t e d _ R e t u r n _ D a t e C a p t i o n > + 
+         < L i n e _ A m o u n t C a p t i o n   E l e m e n t T y p e = " P a r a m e t e r "   E l e m e n t I d = " 1 6 1 7 1 7 1 8 0 0 "   D a t a T y p e = " S t r i n g " > L i n e _ A m o u n t C a p t i o n < / L i n e _ A m o u n t C a p t i o n > + 
+         < N o _ C a p t i o n   E l e m e n t T y p e = " P a r a m e t e r "   E l e m e n t I d = " 1 0 8 0 6 9 1 2 5 3 "   D a t a T y p e = " S t r i n g " > N o _ C a p t i o n < / N o _ C a p t i o n > + 
+         < R e n t a l _ D a t e C a p t i o n   E l e m e n t T y p e = " P a r a m e t e r "   E l e m e n t I d = " 1 5 0 8 5 7 0 5 0 2 "   D a t a T y p e = " S t r i n g " > R e n t a l _ D a t e C a p t i o n < / R e n t a l _ D a t e C a p t i o n > + 
+         < R e n t a l _ D a y s C a p t i o n   E l e m e n t T y p e = " P a r a m e t e r "   E l e m e n t I d = " 1 8 5 9 4 2 2 4 3 5 "   D a t a T y p e = " S t r i n g " > R e n t a l _ D a y s C a p t i o n < / R e n t a l _ D a y s C a p t i o n > + 
+         < R e p o r t T i t l e   E l e m e n t T y p e = " P a r a m e t e r "   E l e m e n t I d = " 1 4 7 9 0 2 5 3 9 "   D a t a T y p e = " S t r i n g " > R e p o r t T i t l e < / R e p o r t T i t l e > + 
+         < S t a t u s C a p t i o n   E l e m e n t T y p e = " P a r a m e t e r "   E l e m e n t I d = " 1 6 3 4 1 4 4 5 5 1 "   D a t a T y p e = " S t r i n g " > S t a t u s C a p t i o n < / S t a t u s C a p t i o n >   
      < / L a b e l s >   
-     < C u s t o m e r > - 
-         < C u r r e n t D a t e _ > C u r r e n t D a t e _ < / C u r r e n t D a t e _ > - 
-         < C u s t o m e r N a m e > C u s t o m e r N a m e < / C u s t o m e r N a m e > - 
-         < C u s t o m e r N o _ > C u s t o m e r N o _ < / C u s t o m e r N o _ > - 
-         < R e n t a l _ H e a d e r > - 
-             < A c t u a l _ R e t u r n _ D a t e > A c t u a l _ R e t u r n _ D a t e < / A c t u a l _ R e t u r n _ D a t e > - 
-             < E x p e c t e d _ R e t u r n _ D a t e > E x p e c t e d _ R e t u r n _ D a t e < / E x p e c t e d _ R e t u r n _ D a t e > - 
-             < N o _ > N o _ < / N o _ > - 
-             < R e n t a l _ D a t e > R e n t a l _ D a t e < / R e n t a l _ D a t e > - 
-             < S t a t u s > S t a t u s < / S t a t u s > - 
-             < R e n t a l _ L i n e > - 
-                 < B i c y c l e _ N o _ > B i c y c l e _ N o _ < / B i c y c l e _ N o _ > - 
-                 < D a i l y _ R a t e > D a i l y _ R a t e < / D a i l y _ R a t e > - 
-                 < D e s c r i p t i o n > D e s c r i p t i o n < / D e s c r i p t i o n > - 
-                 < L i n e _ A m o u n t > L i n e _ A m o u n t < / L i n e _ A m o u n t > - 
-                 < R e n t a l _ D a y s > R e n t a l _ D a y s < / R e n t a l _ D a y s > +     < T o o l t i p s > + 
+         < T o o l t i p   c o l u m n = " C u s t o m e r N o _ "   E l e m e n t I d = " 8 9 5 0 3 9 8 5 " > + 
+             < T o o l t i p T e x t   l a n g = " e n - U S " > S p e c i f i e s   t h e   n u m b e r   o f   t h e   c u s t o m e r .   T h e   f i e l d   i s   e i t h e r   f i l l e d   a u t o m a t i c a l l y   f r o m   a   d e f i n e d   n u m b e r   s e r i e s ,   o r   y o u   e n t e r   t h e   n u m b e r   m a n u a l l y   b e c a u s e   y o u   h a v e   e n a b l e d   m a n u a l   n u m b e r   e n t r y   i n   t h e   n u m b e r - s e r i e s   s e t u p . < / T o o l t i p T e x t > + 
+         < / T o o l t i p > + 
+         < T o o l t i p   c o l u m n = " C u s t o m e r N a m e "   E l e m e n t I d = " 2 6 5 4 9 6 8 2 6 " > + 
+             < T o o l t i p T e x t   l a n g = " e n - U S " > S p e c i f i e s   t h e   c u s t o m e r ' s   n a m e   t h a t   a p p e a r s   o n   a l l   r e l a t e d   d o c u m e n t s .   F o r   c o m p a n i e s ,   s p e c i f y   t h e   c o m p a n y ' s   n a m e   h e r e ,   a n d   t h e n   a d d   t h e   r e l e v a n t   p e o p l e   a s   c o n t a c t s   t h a t   y o u   l i n k   t o   t h i s   c u s t o m e r . < / T o o l t i p T e x t > + 
+         < / T o o l t i p > + 
+     < / T o o l t i p s > + 
+     < C u s t o m e r   E l e m e n t T y p e = " D a t a I t e m "   E l e m e n t I d = " 1 5 2 5 1 9 1 9 9 " > + 
+         < C u r r e n t D a t e _   E l e m e n t T y p e = " C o l u m n "   E l e m e n t I d = " 4 7 8 2 7 1 8 6 5 "   D a t a T y p e = " D a t e " > C u r r e n t D a t e _ < / C u r r e n t D a t e _ > + 
+         < C u s t o m e r N a m e   E l e m e n t T y p e = " C o l u m n "   E l e m e n t I d = " 2 6 5 4 9 6 8 2 6 "   D a t a T y p e = " T e x t " > C u s t o m e r N a m e < / C u s t o m e r N a m e > + 
+         < C u s t o m e r N o _   E l e m e n t T y p e = " C o l u m n "   E l e m e n t I d = " 8 9 5 0 3 9 8 5 "   D a t a T y p e = " C o d e " > C u s t o m e r N o _ < / C u s t o m e r N o _ > + 
+         < R e n t a l _ H e a d e r   E l e m e n t T y p e = " D a t a I t e m "   E l e m e n t I d = " 6 5 8 2 2 0 6 9 9 " > + 
+             < A c t u a l _ R e t u r n _ D a t e   E l e m e n t T y p e = " C o l u m n "   E l e m e n t I d = " 1 0 1 0 7 6 2 7 6 5 "   D a t a T y p e = " D a t e " > A c t u a l _ R e t u r n _ D a t e < / A c t u a l _ R e t u r n _ D a t e > + 
+             < E x p e c t e d _ R e t u r n _ D a t e   E l e m e n t T y p e = " C o l u m n "   E l e m e n t I d = " 1 9 3 0 8 5 9 1 5 "   D a t a T y p e = " D a t e " > E x p e c t e d _ R e t u r n _ D a t e < / E x p e c t e d _ R e t u r n _ D a t e > + 
+             < N o _   E l e m e n t T y p e = " C o l u m n "   E l e m e n t I d = " 1 0 8 0 6 9 1 2 5 3 "   D a t a T y p e = " I n t e g e r " > N o _ < / N o _ > + 
+             < R e n t a l _ D a t e   E l e m e n t T y p e = " C o l u m n "   E l e m e n t I d = " 1 5 0 8 5 7 0 5 0 2 "   D a t a T y p e = " D a t e " > R e n t a l _ D a t e < / R e n t a l _ D a t e > + 
+             < S t a t u s   E l e m e n t T y p e = " C o l u m n "   E l e m e n t I d = " 1 6 3 4 1 4 4 5 5 1 "   D a t a T y p e = " E n u m " > S t a t u s < / S t a t u s > + 
+             < R e n t a l _ L i n e   E l e m e n t T y p e = " D a t a I t e m "   E l e m e n t I d = " 7 2 9 8 0 6 3 8 8 " > + 
+                 < B i c y c l e _ N o _   E l e m e n t T y p e = " C o l u m n "   E l e m e n t I d = " 1 3 0 1 0 8 3 7 8 5 "   D a t a T y p e = " C o d e " > B i c y c l e _ N o _ < / B i c y c l e _ N o _ > + 
+                 < D a i l y _ R a t e   E l e m e n t T y p e = " C o l u m n "   E l e m e n t I d = " 7 4 3 0 3 2 7 1 9 "   D a t a T y p e = " D e c i m a l " > D a i l y _ R a t e < / D a i l y _ R a t e > + 
+                 < D e s c r i p t i o n   E l e m e n t T y p e = " C o l u m n "   E l e m e n t I d = " 1 3 1 4 3 5 1 3 0 7 "   D a t a T y p e = " T e x t " > D e s c r i p t i o n < / D e s c r i p t i o n > + 
+                 < L i n e _ A m o u n t   E l e m e n t T y p e = " C o l u m n "   E l e m e n t I d = " 1 6 1 7 1 7 1 8 0 0 "   D a t a T y p e = " D e c i m a l " > L i n e _ A m o u n t < / L i n e _ A m o u n t > + 
+                 < R e n t a l _ D a y s   E l e m e n t T y p e = " C o l u m n "   E l e m e n t I d = " 1 8 5 9 4 2 2 4 3 5 "   D a t a T y p e = " I n t e g e r " > R e n t a l _ D a y s < / R e n t a l _ D a y s >   
              < / R e n t a l _ L i n e >   
@@ -2319,17 +2244,17 @@
 </file>
 
 <file path=customXml/itemProps1.xml><?xml version="1.0" encoding="utf-8"?>
-<ds:datastoreItem xmlns:ds="http://schemas.openxmlformats.org/officeDocument/2006/customXml" ds:itemID="{FA8D0DA3-2176-4B14-B44C-282CC4FD514E}">
+<ds:datastoreItem xmlns:ds="http://schemas.openxmlformats.org/officeDocument/2006/customXml" ds:itemID="{C11D49A8-DB31-44A7-A755-5CA23EDD3BF7}">
   <ds:schemaRefs>
-    <ds:schemaRef ds:uri="urn:microsoft-dynamics-businesscentral/internal/extended/reports/Bicycle_Rental_Report/50400/"/>
+    <ds:schemaRef ds:uri="urn:microsoft-dynamics-nav/reports/Bicycle_Rental_Report/50400/"/>
   </ds:schemaRefs>
 </ds:datastoreItem>
 </file>
 
 <file path=customXml/itemProps2.xml><?xml version="1.0" encoding="utf-8"?>
-<ds:datastoreItem xmlns:ds="http://schemas.openxmlformats.org/officeDocument/2006/customXml" ds:itemID="{773EEAEE-57CF-46CA-BEB5-CD936B803A2D}">
+<ds:datastoreItem xmlns:ds="http://schemas.openxmlformats.org/officeDocument/2006/customXml" ds:itemID="{D20DF35E-7F89-4EC1-B072-5954D8946D8E}">
   <ds:schemaRefs>
-    <ds:schemaRef ds:uri="urn:microsoft-dynamics-nav/reports/Bicycle_Rental_Report/50400/"/>
+    <ds:schemaRef ds:uri="urn:microsoft-dynamics-businesscentral/internal/extended/reports/Bicycle_Rental_Report/50400/"/>
   </ds:schemaRefs>
 </ds:datastoreItem>
 </file>
</xml_diff>